<commit_message>
Complete Task 1.3 - TextProcessor with 2 DLLs and WiX installer
</commit_message>
<xml_diff>
--- a/port1.docx
+++ b/port1.docx
@@ -39,7 +39,13 @@
         <w:jc w:val="center"/>
       </w:pPr>
       <w:r>
-        <w:t>Submission Date: 18 August 2026</w:t>
+        <w:t xml:space="preserve">Submission Date: </w:t>
+      </w:r>
+      <w:r>
+        <w:t>21</w:t>
+      </w:r>
+      <w:r>
+        <w:t xml:space="preserve"> August 2026</w:t>
       </w:r>
     </w:p>
     <w:p>
@@ -55,6 +61,443 @@
         <w:t>Target Level: 1.4 (HD)</w:t>
       </w:r>
     </w:p>
+    <w:p>
+      <w:pPr>
+        <w:jc w:val="center"/>
+      </w:pPr>
+      <w:r>
+        <w:t xml:space="preserve">GitHub: </w:t>
+      </w:r>
+      <w:hyperlink r:id="rId6" w:history="1">
+        <w:r>
+          <w:rPr>
+            <w:rStyle w:val="Hyperlink"/>
+          </w:rPr>
+          <w:t>https://github.com/chenchartist/Software-deployme</w:t>
+        </w:r>
+        <w:r>
+          <w:rPr>
+            <w:rStyle w:val="Hyperlink"/>
+          </w:rPr>
+          <w:t>n</w:t>
+        </w:r>
+        <w:r>
+          <w:rPr>
+            <w:rStyle w:val="Hyperlink"/>
+          </w:rPr>
+          <w:t>t-and-evolution</w:t>
+        </w:r>
+      </w:hyperlink>
+    </w:p>
+    <w:p>
+      <w:pPr>
+        <w:jc w:val="center"/>
+      </w:pPr>
+    </w:p>
+    <w:p>
+      <w:r>
+        <w:br w:type="page"/>
+      </w:r>
+    </w:p>
+    <w:sdt>
+      <w:sdtPr>
+        <w:id w:val="927771338"/>
+        <w:docPartObj>
+          <w:docPartGallery w:val="Table of Contents"/>
+          <w:docPartUnique/>
+        </w:docPartObj>
+      </w:sdtPr>
+      <w:sdtEndPr>
+        <w:rPr>
+          <w:rFonts w:asciiTheme="minorHAnsi" w:eastAsiaTheme="minorHAnsi" w:hAnsiTheme="minorHAnsi" w:cstheme="minorBidi"/>
+          <w:b/>
+          <w:bCs/>
+          <w:noProof/>
+          <w:color w:val="auto"/>
+          <w:kern w:val="2"/>
+          <w:sz w:val="24"/>
+          <w:szCs w:val="24"/>
+          <w:lang w:val="en-ID"/>
+          <w14:ligatures w14:val="standardContextual"/>
+        </w:rPr>
+      </w:sdtEndPr>
+      <w:sdtContent>
+        <w:p>
+          <w:pPr>
+            <w:pStyle w:val="TOCHeading"/>
+          </w:pPr>
+          <w:r>
+            <w:t xml:space="preserve">Table of </w:t>
+          </w:r>
+          <w:r>
+            <w:t>Contents</w:t>
+          </w:r>
+        </w:p>
+        <w:p>
+          <w:pPr>
+            <w:pStyle w:val="TOC1"/>
+            <w:tabs>
+              <w:tab w:val="left" w:pos="720"/>
+              <w:tab w:val="right" w:leader="dot" w:pos="9016"/>
+            </w:tabs>
+            <w:rPr>
+              <w:rFonts w:eastAsiaTheme="minorEastAsia"/>
+              <w:noProof/>
+              <w:lang w:eastAsia="en-ID"/>
+            </w:rPr>
+          </w:pPr>
+          <w:r>
+            <w:fldChar w:fldCharType="begin"/>
+          </w:r>
+          <w:r>
+            <w:instrText xml:space="preserve"> TOC \o "1-3" \h \z \u </w:instrText>
+          </w:r>
+          <w:r>
+            <w:fldChar w:fldCharType="separate"/>
+          </w:r>
+          <w:hyperlink w:anchor="_Toc238225774" w:history="1">
+            <w:r>
+              <w:rPr>
+                <w:rStyle w:val="Hyperlink"/>
+                <w:noProof/>
+              </w:rPr>
+              <w:t>1.1</w:t>
+            </w:r>
+            <w:r>
+              <w:rPr>
+                <w:rFonts w:eastAsiaTheme="minorEastAsia"/>
+                <w:noProof/>
+                <w:lang w:eastAsia="en-ID"/>
+              </w:rPr>
+              <w:tab/>
+            </w:r>
+            <w:r>
+              <w:rPr>
+                <w:rStyle w:val="Hyperlink"/>
+                <w:noProof/>
+              </w:rPr>
+              <w:t>Sample App</w:t>
+            </w:r>
+            <w:r>
+              <w:rPr>
+                <w:noProof/>
+                <w:webHidden/>
+              </w:rPr>
+              <w:tab/>
+            </w:r>
+            <w:r>
+              <w:rPr>
+                <w:noProof/>
+                <w:webHidden/>
+              </w:rPr>
+              <w:fldChar w:fldCharType="begin"/>
+            </w:r>
+            <w:r>
+              <w:rPr>
+                <w:noProof/>
+                <w:webHidden/>
+              </w:rPr>
+              <w:instrText xml:space="preserve"> PAGEREF _Toc238225774 \h </w:instrText>
+            </w:r>
+            <w:r>
+              <w:rPr>
+                <w:noProof/>
+                <w:webHidden/>
+              </w:rPr>
+            </w:r>
+            <w:r>
+              <w:rPr>
+                <w:noProof/>
+                <w:webHidden/>
+              </w:rPr>
+              <w:fldChar w:fldCharType="separate"/>
+            </w:r>
+            <w:r>
+              <w:rPr>
+                <w:noProof/>
+                <w:webHidden/>
+              </w:rPr>
+              <w:t>3</w:t>
+            </w:r>
+            <w:r>
+              <w:rPr>
+                <w:noProof/>
+                <w:webHidden/>
+              </w:rPr>
+              <w:fldChar w:fldCharType="end"/>
+            </w:r>
+          </w:hyperlink>
+        </w:p>
+        <w:p>
+          <w:pPr>
+            <w:pStyle w:val="TOC1"/>
+            <w:tabs>
+              <w:tab w:val="left" w:pos="720"/>
+              <w:tab w:val="right" w:leader="dot" w:pos="9016"/>
+            </w:tabs>
+            <w:rPr>
+              <w:rFonts w:eastAsiaTheme="minorEastAsia"/>
+              <w:noProof/>
+              <w:lang w:eastAsia="en-ID"/>
+            </w:rPr>
+          </w:pPr>
+          <w:hyperlink w:anchor="_Toc238225775" w:history="1">
+            <w:r>
+              <w:rPr>
+                <w:rStyle w:val="Hyperlink"/>
+                <w:noProof/>
+              </w:rPr>
+              <w:t>1.2</w:t>
+            </w:r>
+            <w:r>
+              <w:rPr>
+                <w:rFonts w:eastAsiaTheme="minorEastAsia"/>
+                <w:noProof/>
+                <w:lang w:eastAsia="en-ID"/>
+              </w:rPr>
+              <w:tab/>
+            </w:r>
+            <w:r>
+              <w:rPr>
+                <w:rStyle w:val="Hyperlink"/>
+                <w:noProof/>
+              </w:rPr>
+              <w:t>Simple Text Processor</w:t>
+            </w:r>
+            <w:r>
+              <w:rPr>
+                <w:noProof/>
+                <w:webHidden/>
+              </w:rPr>
+              <w:tab/>
+            </w:r>
+            <w:r>
+              <w:rPr>
+                <w:noProof/>
+                <w:webHidden/>
+              </w:rPr>
+              <w:fldChar w:fldCharType="begin"/>
+            </w:r>
+            <w:r>
+              <w:rPr>
+                <w:noProof/>
+                <w:webHidden/>
+              </w:rPr>
+              <w:instrText xml:space="preserve"> PAGEREF _Toc238225775 \h </w:instrText>
+            </w:r>
+            <w:r>
+              <w:rPr>
+                <w:noProof/>
+                <w:webHidden/>
+              </w:rPr>
+            </w:r>
+            <w:r>
+              <w:rPr>
+                <w:noProof/>
+                <w:webHidden/>
+              </w:rPr>
+              <w:fldChar w:fldCharType="separate"/>
+            </w:r>
+            <w:r>
+              <w:rPr>
+                <w:noProof/>
+                <w:webHidden/>
+              </w:rPr>
+              <w:t>6</w:t>
+            </w:r>
+            <w:r>
+              <w:rPr>
+                <w:noProof/>
+                <w:webHidden/>
+              </w:rPr>
+              <w:fldChar w:fldCharType="end"/>
+            </w:r>
+          </w:hyperlink>
+        </w:p>
+        <w:p>
+          <w:pPr>
+            <w:pStyle w:val="TOC1"/>
+            <w:tabs>
+              <w:tab w:val="left" w:pos="720"/>
+              <w:tab w:val="right" w:leader="dot" w:pos="9016"/>
+            </w:tabs>
+            <w:rPr>
+              <w:rFonts w:eastAsiaTheme="minorEastAsia"/>
+              <w:noProof/>
+              <w:lang w:eastAsia="en-ID"/>
+            </w:rPr>
+          </w:pPr>
+          <w:hyperlink w:anchor="_Toc238225776" w:history="1">
+            <w:r>
+              <w:rPr>
+                <w:rStyle w:val="Hyperlink"/>
+                <w:noProof/>
+              </w:rPr>
+              <w:t xml:space="preserve">1.3 </w:t>
+            </w:r>
+            <w:r>
+              <w:rPr>
+                <w:rFonts w:eastAsiaTheme="minorEastAsia"/>
+                <w:noProof/>
+                <w:lang w:eastAsia="en-ID"/>
+              </w:rPr>
+              <w:tab/>
+            </w:r>
+            <w:r>
+              <w:rPr>
+                <w:rStyle w:val="Hyperlink"/>
+                <w:noProof/>
+              </w:rPr>
+              <w:t>Adding DLLs</w:t>
+            </w:r>
+            <w:r>
+              <w:rPr>
+                <w:noProof/>
+                <w:webHidden/>
+              </w:rPr>
+              <w:tab/>
+            </w:r>
+            <w:r>
+              <w:rPr>
+                <w:noProof/>
+                <w:webHidden/>
+              </w:rPr>
+              <w:fldChar w:fldCharType="begin"/>
+            </w:r>
+            <w:r>
+              <w:rPr>
+                <w:noProof/>
+                <w:webHidden/>
+              </w:rPr>
+              <w:instrText xml:space="preserve"> PAGEREF _Toc238225776 \h </w:instrText>
+            </w:r>
+            <w:r>
+              <w:rPr>
+                <w:noProof/>
+                <w:webHidden/>
+              </w:rPr>
+            </w:r>
+            <w:r>
+              <w:rPr>
+                <w:noProof/>
+                <w:webHidden/>
+              </w:rPr>
+              <w:fldChar w:fldCharType="separate"/>
+            </w:r>
+            <w:r>
+              <w:rPr>
+                <w:noProof/>
+                <w:webHidden/>
+              </w:rPr>
+              <w:t>10</w:t>
+            </w:r>
+            <w:r>
+              <w:rPr>
+                <w:noProof/>
+                <w:webHidden/>
+              </w:rPr>
+              <w:fldChar w:fldCharType="end"/>
+            </w:r>
+          </w:hyperlink>
+        </w:p>
+        <w:p>
+          <w:pPr>
+            <w:pStyle w:val="TOC1"/>
+            <w:tabs>
+              <w:tab w:val="left" w:pos="720"/>
+              <w:tab w:val="right" w:leader="dot" w:pos="9016"/>
+            </w:tabs>
+            <w:rPr>
+              <w:rFonts w:eastAsiaTheme="minorEastAsia"/>
+              <w:noProof/>
+              <w:lang w:eastAsia="en-ID"/>
+            </w:rPr>
+          </w:pPr>
+          <w:hyperlink w:anchor="_Toc238225777" w:history="1">
+            <w:r>
+              <w:rPr>
+                <w:rStyle w:val="Hyperlink"/>
+                <w:noProof/>
+              </w:rPr>
+              <w:t xml:space="preserve">1.4 </w:t>
+            </w:r>
+            <w:r>
+              <w:rPr>
+                <w:rFonts w:eastAsiaTheme="minorEastAsia"/>
+                <w:noProof/>
+                <w:lang w:eastAsia="en-ID"/>
+              </w:rPr>
+              <w:tab/>
+            </w:r>
+            <w:r>
+              <w:rPr>
+                <w:rStyle w:val="Hyperlink"/>
+                <w:noProof/>
+              </w:rPr>
+              <w:t>GitHub Release + WinGet</w:t>
+            </w:r>
+            <w:r>
+              <w:rPr>
+                <w:noProof/>
+                <w:webHidden/>
+              </w:rPr>
+              <w:tab/>
+            </w:r>
+            <w:r>
+              <w:rPr>
+                <w:noProof/>
+                <w:webHidden/>
+              </w:rPr>
+              <w:fldChar w:fldCharType="begin"/>
+            </w:r>
+            <w:r>
+              <w:rPr>
+                <w:noProof/>
+                <w:webHidden/>
+              </w:rPr>
+              <w:instrText xml:space="preserve"> PAGEREF _Toc238225777 \h </w:instrText>
+            </w:r>
+            <w:r>
+              <w:rPr>
+                <w:noProof/>
+                <w:webHidden/>
+              </w:rPr>
+            </w:r>
+            <w:r>
+              <w:rPr>
+                <w:noProof/>
+                <w:webHidden/>
+              </w:rPr>
+              <w:fldChar w:fldCharType="separate"/>
+            </w:r>
+            <w:r>
+              <w:rPr>
+                <w:noProof/>
+                <w:webHidden/>
+              </w:rPr>
+              <w:t>15</w:t>
+            </w:r>
+            <w:r>
+              <w:rPr>
+                <w:noProof/>
+                <w:webHidden/>
+              </w:rPr>
+              <w:fldChar w:fldCharType="end"/>
+            </w:r>
+          </w:hyperlink>
+        </w:p>
+        <w:p>
+          <w:r>
+            <w:rPr>
+              <w:b/>
+              <w:bCs/>
+              <w:noProof/>
+            </w:rPr>
+            <w:fldChar w:fldCharType="end"/>
+          </w:r>
+        </w:p>
+      </w:sdtContent>
+    </w:sdt>
     <w:p/>
     <w:p/>
     <w:p>
@@ -63,15 +506,47 @@
       </w:r>
     </w:p>
     <w:p>
+      <w:pPr>
+        <w:pStyle w:val="Heading1"/>
+        <w:numPr>
+          <w:ilvl w:val="1"/>
+          <w:numId w:val="3"/>
+        </w:numPr>
+      </w:pPr>
+      <w:bookmarkStart w:id="0" w:name="_Toc238225774"/>
       <w:r>
         <w:lastRenderedPageBreak/>
-        <w:t>1.1</w:t>
-      </w:r>
-    </w:p>
-    <w:p>
-      <w:r>
-        <w:t>Code for SampleApp</w:t>
-      </w:r>
+        <w:t>Sample App</w:t>
+      </w:r>
+      <w:bookmarkEnd w:id="0"/>
+    </w:p>
+    <w:p>
+      <w:r>
+        <w:t xml:space="preserve">For the first task I followed the instruction given in the assignment to download all the necessary software, like visual studio, Wix, etc; and building a simple Sample app to print out some sentences </w:t>
+      </w:r>
+      <w:r>
+        <w:t xml:space="preserve">like </w:t>
+      </w:r>
+      <w:r>
+        <w:t>“Hello World”</w:t>
+      </w:r>
+    </w:p>
+    <w:p>
+      <w:pPr>
+        <w:pStyle w:val="ListParagraph"/>
+        <w:numPr>
+          <w:ilvl w:val="0"/>
+          <w:numId w:val="5"/>
+        </w:numPr>
+      </w:pPr>
+      <w:r>
+        <w:t xml:space="preserve">Code for </w:t>
+      </w:r>
+      <w:proofErr w:type="spellStart"/>
+      <w:r>
+        <w:t>SampleApp</w:t>
+      </w:r>
+      <w:proofErr w:type="spellEnd"/>
     </w:p>
     <w:p>
       <w:r>
@@ -94,7 +569,7 @@
                     <pic:cNvPicPr/>
                   </pic:nvPicPr>
                   <pic:blipFill>
-                    <a:blip r:embed="rId4"/>
+                    <a:blip r:embed="rId7"/>
                     <a:stretch>
                       <a:fillRect/>
                     </a:stretch>
@@ -116,9 +591,24 @@
       </w:r>
     </w:p>
     <w:p>
-      <w:r>
-        <w:t>Building SampleAp</w:t>
-      </w:r>
+      <w:pPr>
+        <w:pStyle w:val="ListParagraph"/>
+        <w:numPr>
+          <w:ilvl w:val="0"/>
+          <w:numId w:val="5"/>
+        </w:numPr>
+      </w:pPr>
+      <w:r>
+        <w:t xml:space="preserve">Building </w:t>
+      </w:r>
+      <w:proofErr w:type="spellStart"/>
+      <w:r>
+        <w:t>SampleAp</w:t>
+      </w:r>
+      <w:r>
+        <w:t>p</w:t>
+      </w:r>
+      <w:proofErr w:type="spellEnd"/>
     </w:p>
     <w:p>
       <w:r>
@@ -141,7 +631,7 @@
                     <pic:cNvPicPr/>
                   </pic:nvPicPr>
                   <pic:blipFill>
-                    <a:blip r:embed="rId5"/>
+                    <a:blip r:embed="rId8"/>
                     <a:stretch>
                       <a:fillRect/>
                     </a:stretch>
@@ -163,6 +653,13 @@
       </w:r>
     </w:p>
     <w:p>
+      <w:pPr>
+        <w:pStyle w:val="ListParagraph"/>
+        <w:numPr>
+          <w:ilvl w:val="0"/>
+          <w:numId w:val="5"/>
+        </w:numPr>
+      </w:pPr>
       <w:r>
         <w:t>Folder consisting of SampleApp.exe</w:t>
       </w:r>
@@ -188,7 +685,7 @@
                     <pic:cNvPicPr/>
                   </pic:nvPicPr>
                   <pic:blipFill>
-                    <a:blip r:embed="rId6"/>
+                    <a:blip r:embed="rId9"/>
                     <a:stretch>
                       <a:fillRect/>
                     </a:stretch>
@@ -210,9 +707,21 @@
       </w:r>
     </w:p>
     <w:p>
-      <w:r>
-        <w:t>Setting up for SampleAppSetup</w:t>
-      </w:r>
+      <w:pPr>
+        <w:pStyle w:val="ListParagraph"/>
+        <w:numPr>
+          <w:ilvl w:val="0"/>
+          <w:numId w:val="5"/>
+        </w:numPr>
+      </w:pPr>
+      <w:r>
+        <w:t xml:space="preserve">Setting up for </w:t>
+      </w:r>
+      <w:proofErr w:type="spellStart"/>
+      <w:r>
+        <w:t>SampleAppSetup</w:t>
+      </w:r>
+      <w:proofErr w:type="spellEnd"/>
     </w:p>
     <w:p>
       <w:r>
@@ -236,7 +745,7 @@
                     <pic:cNvPicPr/>
                   </pic:nvPicPr>
                   <pic:blipFill>
-                    <a:blip r:embed="rId7"/>
+                    <a:blip r:embed="rId10"/>
                     <a:stretch>
                       <a:fillRect/>
                     </a:stretch>
@@ -258,6 +767,13 @@
       </w:r>
     </w:p>
     <w:p>
+      <w:pPr>
+        <w:pStyle w:val="ListParagraph"/>
+        <w:numPr>
+          <w:ilvl w:val="0"/>
+          <w:numId w:val="5"/>
+        </w:numPr>
+      </w:pPr>
       <w:r>
         <w:t>Add reference</w:t>
       </w:r>
@@ -283,7 +799,7 @@
                     <pic:cNvPicPr/>
                   </pic:nvPicPr>
                   <pic:blipFill>
-                    <a:blip r:embed="rId8"/>
+                    <a:blip r:embed="rId11"/>
                     <a:stretch>
                       <a:fillRect/>
                     </a:stretch>
@@ -305,9 +821,29 @@
       </w:r>
     </w:p>
     <w:p>
+      <w:pPr>
+        <w:pStyle w:val="ListParagraph"/>
+        <w:numPr>
+          <w:ilvl w:val="0"/>
+          <w:numId w:val="5"/>
+        </w:numPr>
+      </w:pPr>
+      <w:proofErr w:type="spellStart"/>
       <w:r>
         <w:lastRenderedPageBreak/>
-        <w:t>SampleAppSetup (Product.wxs)</w:t>
+        <w:t>SampleAppSetup</w:t>
+      </w:r>
+      <w:proofErr w:type="spellEnd"/>
+      <w:r>
+        <w:t xml:space="preserve"> (</w:t>
+      </w:r>
+      <w:proofErr w:type="spellStart"/>
+      <w:r>
+        <w:t>Product.wxs</w:t>
+      </w:r>
+      <w:proofErr w:type="spellEnd"/>
+      <w:r>
+        <w:t>)</w:t>
       </w:r>
     </w:p>
     <w:p>
@@ -331,7 +867,7 @@
                     <pic:cNvPicPr/>
                   </pic:nvPicPr>
                   <pic:blipFill>
-                    <a:blip r:embed="rId9"/>
+                    <a:blip r:embed="rId12"/>
                     <a:stretch>
                       <a:fillRect/>
                     </a:stretch>
@@ -353,6 +889,13 @@
       </w:r>
     </w:p>
     <w:p>
+      <w:pPr>
+        <w:pStyle w:val="ListParagraph"/>
+        <w:numPr>
+          <w:ilvl w:val="0"/>
+          <w:numId w:val="5"/>
+        </w:numPr>
+      </w:pPr>
       <w:r>
         <w:t>Build setup outcome</w:t>
       </w:r>
@@ -378,7 +921,7 @@
                     <pic:cNvPicPr/>
                   </pic:nvPicPr>
                   <pic:blipFill>
-                    <a:blip r:embed="rId10"/>
+                    <a:blip r:embed="rId13"/>
                     <a:stretch>
                       <a:fillRect/>
                     </a:stretch>
@@ -420,7 +963,7 @@
                     <pic:cNvPicPr/>
                   </pic:nvPicPr>
                   <pic:blipFill>
-                    <a:blip r:embed="rId11"/>
+                    <a:blip r:embed="rId14"/>
                     <a:stretch>
                       <a:fillRect/>
                     </a:stretch>
@@ -442,6 +985,13 @@
       </w:r>
     </w:p>
     <w:p>
+      <w:pPr>
+        <w:pStyle w:val="ListParagraph"/>
+        <w:numPr>
+          <w:ilvl w:val="0"/>
+          <w:numId w:val="5"/>
+        </w:numPr>
+      </w:pPr>
       <w:r>
         <w:t>Run the window installer</w:t>
       </w:r>
@@ -467,7 +1017,7 @@
                     <pic:cNvPicPr/>
                   </pic:nvPicPr>
                   <pic:blipFill>
-                    <a:blip r:embed="rId12"/>
+                    <a:blip r:embed="rId15"/>
                     <a:stretch>
                       <a:fillRect/>
                     </a:stretch>
@@ -489,6 +1039,13 @@
       </w:r>
     </w:p>
     <w:p>
+      <w:pPr>
+        <w:pStyle w:val="ListParagraph"/>
+        <w:numPr>
+          <w:ilvl w:val="0"/>
+          <w:numId w:val="5"/>
+        </w:numPr>
+      </w:pPr>
       <w:r>
         <w:t>File in C Drive, Program files</w:t>
       </w:r>
@@ -514,7 +1071,7 @@
                     <pic:cNvPicPr/>
                   </pic:nvPicPr>
                   <pic:blipFill>
-                    <a:blip r:embed="rId13"/>
+                    <a:blip r:embed="rId16"/>
                     <a:stretch>
                       <a:fillRect/>
                     </a:stretch>
@@ -536,6 +1093,13 @@
       </w:r>
     </w:p>
     <w:p>
+      <w:pPr>
+        <w:pStyle w:val="ListParagraph"/>
+        <w:numPr>
+          <w:ilvl w:val="0"/>
+          <w:numId w:val="5"/>
+        </w:numPr>
+      </w:pPr>
       <w:r>
         <w:t>Output</w:t>
       </w:r>
@@ -562,7 +1126,7 @@
                     <pic:cNvPicPr/>
                   </pic:nvPicPr>
                   <pic:blipFill>
-                    <a:blip r:embed="rId14"/>
+                    <a:blip r:embed="rId17"/>
                     <a:stretch>
                       <a:fillRect/>
                     </a:stretch>
@@ -583,25 +1147,135 @@
         </w:drawing>
       </w:r>
     </w:p>
+    <w:p>
+      <w:r>
+        <w:t>#instalation</w:t>
+      </w:r>
+    </w:p>
+    <w:p>
+      <w:r>
+        <w:t xml:space="preserve">1. go to </w:t>
+      </w:r>
+      <w:proofErr w:type="spellStart"/>
+      <w:r>
+        <w:t>SampleApp</w:t>
+      </w:r>
+      <w:proofErr w:type="spellEnd"/>
+      <w:r>
+        <w:t xml:space="preserve"> folder and there will be </w:t>
+      </w:r>
+      <w:proofErr w:type="spellStart"/>
+      <w:r>
+        <w:t>WixExample</w:t>
+      </w:r>
+      <w:proofErr w:type="spellEnd"/>
+      <w:r>
+        <w:t xml:space="preserve"> folder go in go to bin/release/ and then find the Window Installer or </w:t>
+      </w:r>
+      <w:proofErr w:type="spellStart"/>
+      <w:r>
+        <w:t>WixExample</w:t>
+      </w:r>
+      <w:proofErr w:type="spellEnd"/>
+    </w:p>
+    <w:p>
+      <w:r>
+        <w:t>2. click on it and wait for the download</w:t>
+      </w:r>
+    </w:p>
+    <w:p>
+      <w:r>
+        <w:t>3. go to C drive</w:t>
+      </w:r>
+    </w:p>
+    <w:p>
+      <w:r>
+        <w:t xml:space="preserve">4. find program files and then find </w:t>
+      </w:r>
+      <w:proofErr w:type="spellStart"/>
+      <w:r>
+        <w:t>WixExample</w:t>
+      </w:r>
+      <w:proofErr w:type="spellEnd"/>
+    </w:p>
+    <w:p>
+      <w:r>
+        <w:t>5. Run the Application</w:t>
+      </w:r>
+    </w:p>
     <w:p/>
     <w:p>
-      <w:r>
-        <w:t>1.2</w:t>
-      </w:r>
-      <w:r>
-        <w:t xml:space="preserve"> (simple </w:t>
-      </w:r>
-      <w:r>
-        <w:t>text processor)</w:t>
-      </w:r>
-    </w:p>
-    <w:p>
-      <w:r>
-        <w:t>Code (Program.cs)</w:t>
-      </w:r>
-    </w:p>
-    <w:p>
-      <w:r>
+      <w:pPr>
+        <w:pStyle w:val="Heading1"/>
+        <w:numPr>
+          <w:ilvl w:val="1"/>
+          <w:numId w:val="3"/>
+        </w:numPr>
+      </w:pPr>
+      <w:bookmarkStart w:id="1" w:name="_Toc238225775"/>
+      <w:r>
+        <w:t>S</w:t>
+      </w:r>
+      <w:r>
+        <w:t xml:space="preserve">imple </w:t>
+      </w:r>
+      <w:r>
+        <w:t>T</w:t>
+      </w:r>
+      <w:r>
+        <w:t xml:space="preserve">ext </w:t>
+      </w:r>
+      <w:r>
+        <w:t>P</w:t>
+      </w:r>
+      <w:r>
+        <w:t>rocessor</w:t>
+      </w:r>
+      <w:bookmarkEnd w:id="1"/>
+    </w:p>
+    <w:p>
+      <w:r>
+        <w:t xml:space="preserve">For Task 1.2 I made a simple text processor where the user can type in the words or </w:t>
+      </w:r>
+      <w:r>
+        <w:t>sentences,</w:t>
+      </w:r>
+      <w:r>
+        <w:t xml:space="preserve"> they want and simply press the count words button and the software will </w:t>
+      </w:r>
+      <w:r>
+        <w:t>count</w:t>
+      </w:r>
+      <w:r>
+        <w:t xml:space="preserve"> how many words has been typed into the text box.</w:t>
+      </w:r>
+    </w:p>
+    <w:p>
+      <w:pPr>
+        <w:pStyle w:val="ListParagraph"/>
+        <w:numPr>
+          <w:ilvl w:val="0"/>
+          <w:numId w:val="6"/>
+        </w:numPr>
+      </w:pPr>
+      <w:r>
+        <w:t>Code (</w:t>
+      </w:r>
+      <w:proofErr w:type="spellStart"/>
+      <w:r>
+        <w:t>Program.cs</w:t>
+      </w:r>
+      <w:proofErr w:type="spellEnd"/>
+      <w:r>
+        <w:t>)</w:t>
+      </w:r>
+    </w:p>
+    <w:p>
+      <w:r>
+        <w:rPr>
+          <w:noProof/>
+        </w:rPr>
+        <w:lastRenderedPageBreak/>
         <w:drawing>
           <wp:inline distT="0" distB="0" distL="0" distR="0" wp14:anchorId="5AD5ABC3" wp14:editId="107D01A4">
             <wp:extent cx="5731510" cy="3218180"/>
@@ -618,7 +1292,7 @@
                     <pic:cNvPicPr/>
                   </pic:nvPicPr>
                   <pic:blipFill>
-                    <a:blip r:embed="rId15"/>
+                    <a:blip r:embed="rId18"/>
                     <a:stretch>
                       <a:fillRect/>
                     </a:stretch>
@@ -640,12 +1314,22 @@
       </w:r>
     </w:p>
     <w:p>
+      <w:pPr>
+        <w:pStyle w:val="ListParagraph"/>
+        <w:numPr>
+          <w:ilvl w:val="0"/>
+          <w:numId w:val="6"/>
+        </w:numPr>
+      </w:pPr>
       <w:r>
         <w:t>Code (Form1.cs)</w:t>
       </w:r>
     </w:p>
     <w:p>
       <w:r>
+        <w:rPr>
+          <w:noProof/>
+        </w:rPr>
         <w:lastRenderedPageBreak/>
         <w:drawing>
           <wp:inline distT="0" distB="0" distL="0" distR="0" wp14:anchorId="20B3E91B" wp14:editId="2E650F66">
@@ -663,7 +1347,7 @@
                     <pic:cNvPicPr/>
                   </pic:nvPicPr>
                   <pic:blipFill>
-                    <a:blip r:embed="rId16"/>
+                    <a:blip r:embed="rId19"/>
                     <a:stretch>
                       <a:fillRect/>
                     </a:stretch>
@@ -686,6 +1370,9 @@
     </w:p>
     <w:p>
       <w:r>
+        <w:rPr>
+          <w:noProof/>
+        </w:rPr>
         <w:drawing>
           <wp:inline distT="0" distB="0" distL="0" distR="0" wp14:anchorId="0C13D63B" wp14:editId="26B8D0BB">
             <wp:extent cx="5731510" cy="1432560"/>
@@ -702,7 +1389,7 @@
                     <pic:cNvPicPr/>
                   </pic:nvPicPr>
                   <pic:blipFill>
-                    <a:blip r:embed="rId17"/>
+                    <a:blip r:embed="rId20"/>
                     <a:stretch>
                       <a:fillRect/>
                     </a:stretch>
@@ -724,12 +1411,25 @@
       </w:r>
     </w:p>
     <w:p>
+      <w:pPr>
+        <w:pStyle w:val="ListParagraph"/>
+        <w:numPr>
+          <w:ilvl w:val="0"/>
+          <w:numId w:val="6"/>
+        </w:numPr>
+      </w:pPr>
       <w:r>
         <w:t>Build</w:t>
       </w:r>
-    </w:p>
-    <w:p>
-      <w:r>
+      <w:r>
+        <w:t xml:space="preserve"> </w:t>
+      </w:r>
+    </w:p>
+    <w:p>
+      <w:r>
+        <w:rPr>
+          <w:noProof/>
+        </w:rPr>
         <w:lastRenderedPageBreak/>
         <w:drawing>
           <wp:inline distT="0" distB="0" distL="0" distR="0" wp14:anchorId="4A4C4452" wp14:editId="6AE5C98A">
@@ -747,7 +1447,7 @@
                     <pic:cNvPicPr/>
                   </pic:nvPicPr>
                   <pic:blipFill>
-                    <a:blip r:embed="rId18"/>
+                    <a:blip r:embed="rId21"/>
                     <a:stretch>
                       <a:fillRect/>
                     </a:stretch>
@@ -768,14 +1468,1716 @@
         </w:drawing>
       </w:r>
     </w:p>
+    <w:p>
+      <w:r>
+        <w:rPr>
+          <w:noProof/>
+        </w:rPr>
+        <w:drawing>
+          <wp:inline distT="0" distB="0" distL="0" distR="0" wp14:anchorId="5B939D72" wp14:editId="47F4F430">
+            <wp:extent cx="5731510" cy="1264920"/>
+            <wp:effectExtent l="0" t="0" r="2540" b="0"/>
+            <wp:docPr id="763700953" name="Picture 1"/>
+            <wp:cNvGraphicFramePr>
+              <a:graphicFrameLocks xmlns:a="http://schemas.openxmlformats.org/drawingml/2006/main" noChangeAspect="1"/>
+            </wp:cNvGraphicFramePr>
+            <a:graphic xmlns:a="http://schemas.openxmlformats.org/drawingml/2006/main">
+              <a:graphicData uri="http://schemas.openxmlformats.org/drawingml/2006/picture">
+                <pic:pic xmlns:pic="http://schemas.openxmlformats.org/drawingml/2006/picture">
+                  <pic:nvPicPr>
+                    <pic:cNvPr id="763700953" name=""/>
+                    <pic:cNvPicPr/>
+                  </pic:nvPicPr>
+                  <pic:blipFill>
+                    <a:blip r:embed="rId22"/>
+                    <a:stretch>
+                      <a:fillRect/>
+                    </a:stretch>
+                  </pic:blipFill>
+                  <pic:spPr>
+                    <a:xfrm>
+                      <a:off x="0" y="0"/>
+                      <a:ext cx="5731510" cy="1264920"/>
+                    </a:xfrm>
+                    <a:prstGeom prst="rect">
+                      <a:avLst/>
+                    </a:prstGeom>
+                  </pic:spPr>
+                </pic:pic>
+              </a:graphicData>
+            </a:graphic>
+          </wp:inline>
+        </w:drawing>
+      </w:r>
+    </w:p>
+    <w:p>
+      <w:pPr>
+        <w:pStyle w:val="ListParagraph"/>
+        <w:numPr>
+          <w:ilvl w:val="0"/>
+          <w:numId w:val="6"/>
+        </w:numPr>
+      </w:pPr>
+      <w:r>
+        <w:t>1.2 setup (</w:t>
+      </w:r>
+      <w:proofErr w:type="spellStart"/>
+      <w:r>
+        <w:t>Product.wxs</w:t>
+      </w:r>
+      <w:proofErr w:type="spellEnd"/>
+      <w:r>
+        <w:t>, add 1.2 as reference)</w:t>
+      </w:r>
+    </w:p>
+    <w:p>
+      <w:r>
+        <w:rPr>
+          <w:noProof/>
+        </w:rPr>
+        <w:drawing>
+          <wp:inline distT="0" distB="0" distL="0" distR="0" wp14:anchorId="41D2CF21" wp14:editId="326FCABE">
+            <wp:extent cx="5731510" cy="2206625"/>
+            <wp:effectExtent l="0" t="0" r="2540" b="3175"/>
+            <wp:docPr id="1354322269" name="Picture 1"/>
+            <wp:cNvGraphicFramePr>
+              <a:graphicFrameLocks xmlns:a="http://schemas.openxmlformats.org/drawingml/2006/main" noChangeAspect="1"/>
+            </wp:cNvGraphicFramePr>
+            <a:graphic xmlns:a="http://schemas.openxmlformats.org/drawingml/2006/main">
+              <a:graphicData uri="http://schemas.openxmlformats.org/drawingml/2006/picture">
+                <pic:pic xmlns:pic="http://schemas.openxmlformats.org/drawingml/2006/picture">
+                  <pic:nvPicPr>
+                    <pic:cNvPr id="1354322269" name=""/>
+                    <pic:cNvPicPr/>
+                  </pic:nvPicPr>
+                  <pic:blipFill>
+                    <a:blip r:embed="rId23"/>
+                    <a:stretch>
+                      <a:fillRect/>
+                    </a:stretch>
+                  </pic:blipFill>
+                  <pic:spPr>
+                    <a:xfrm>
+                      <a:off x="0" y="0"/>
+                      <a:ext cx="5731510" cy="2206625"/>
+                    </a:xfrm>
+                    <a:prstGeom prst="rect">
+                      <a:avLst/>
+                    </a:prstGeom>
+                  </pic:spPr>
+                </pic:pic>
+              </a:graphicData>
+            </a:graphic>
+          </wp:inline>
+        </w:drawing>
+      </w:r>
+    </w:p>
+    <w:p>
+      <w:r>
+        <w:rPr>
+          <w:noProof/>
+        </w:rPr>
+        <w:drawing>
+          <wp:inline distT="0" distB="0" distL="0" distR="0" wp14:anchorId="0C222D83" wp14:editId="16389F15">
+            <wp:extent cx="2276793" cy="1533739"/>
+            <wp:effectExtent l="0" t="0" r="9525" b="9525"/>
+            <wp:docPr id="2032424308" name="Picture 1"/>
+            <wp:cNvGraphicFramePr>
+              <a:graphicFrameLocks xmlns:a="http://schemas.openxmlformats.org/drawingml/2006/main" noChangeAspect="1"/>
+            </wp:cNvGraphicFramePr>
+            <a:graphic xmlns:a="http://schemas.openxmlformats.org/drawingml/2006/main">
+              <a:graphicData uri="http://schemas.openxmlformats.org/drawingml/2006/picture">
+                <pic:pic xmlns:pic="http://schemas.openxmlformats.org/drawingml/2006/picture">
+                  <pic:nvPicPr>
+                    <pic:cNvPr id="2032424308" name=""/>
+                    <pic:cNvPicPr/>
+                  </pic:nvPicPr>
+                  <pic:blipFill>
+                    <a:blip r:embed="rId24"/>
+                    <a:stretch>
+                      <a:fillRect/>
+                    </a:stretch>
+                  </pic:blipFill>
+                  <pic:spPr>
+                    <a:xfrm>
+                      <a:off x="0" y="0"/>
+                      <a:ext cx="2276793" cy="1533739"/>
+                    </a:xfrm>
+                    <a:prstGeom prst="rect">
+                      <a:avLst/>
+                    </a:prstGeom>
+                  </pic:spPr>
+                </pic:pic>
+              </a:graphicData>
+            </a:graphic>
+          </wp:inline>
+        </w:drawing>
+      </w:r>
+    </w:p>
+    <w:p>
+      <w:r>
+        <w:rPr>
+          <w:noProof/>
+        </w:rPr>
+        <w:drawing>
+          <wp:inline distT="0" distB="0" distL="0" distR="0" wp14:anchorId="5019F9AE" wp14:editId="58686AAD">
+            <wp:extent cx="5731510" cy="722630"/>
+            <wp:effectExtent l="0" t="0" r="2540" b="1270"/>
+            <wp:docPr id="199751992" name="Picture 1"/>
+            <wp:cNvGraphicFramePr>
+              <a:graphicFrameLocks xmlns:a="http://schemas.openxmlformats.org/drawingml/2006/main" noChangeAspect="1"/>
+            </wp:cNvGraphicFramePr>
+            <a:graphic xmlns:a="http://schemas.openxmlformats.org/drawingml/2006/main">
+              <a:graphicData uri="http://schemas.openxmlformats.org/drawingml/2006/picture">
+                <pic:pic xmlns:pic="http://schemas.openxmlformats.org/drawingml/2006/picture">
+                  <pic:nvPicPr>
+                    <pic:cNvPr id="199751992" name=""/>
+                    <pic:cNvPicPr/>
+                  </pic:nvPicPr>
+                  <pic:blipFill>
+                    <a:blip r:embed="rId25"/>
+                    <a:stretch>
+                      <a:fillRect/>
+                    </a:stretch>
+                  </pic:blipFill>
+                  <pic:spPr>
+                    <a:xfrm>
+                      <a:off x="0" y="0"/>
+                      <a:ext cx="5731510" cy="722630"/>
+                    </a:xfrm>
+                    <a:prstGeom prst="rect">
+                      <a:avLst/>
+                    </a:prstGeom>
+                  </pic:spPr>
+                </pic:pic>
+              </a:graphicData>
+            </a:graphic>
+          </wp:inline>
+        </w:drawing>
+      </w:r>
+    </w:p>
+    <w:p>
+      <w:pPr>
+        <w:pStyle w:val="ListParagraph"/>
+        <w:numPr>
+          <w:ilvl w:val="0"/>
+          <w:numId w:val="6"/>
+        </w:numPr>
+      </w:pPr>
+      <w:r>
+        <w:t>Windows installer</w:t>
+      </w:r>
+    </w:p>
+    <w:p>
+      <w:r>
+        <w:rPr>
+          <w:noProof/>
+        </w:rPr>
+        <w:lastRenderedPageBreak/>
+        <w:drawing>
+          <wp:inline distT="0" distB="0" distL="0" distR="0" wp14:anchorId="65FA9816" wp14:editId="7A399D54">
+            <wp:extent cx="5731510" cy="1152525"/>
+            <wp:effectExtent l="0" t="0" r="2540" b="9525"/>
+            <wp:docPr id="201152809" name="Picture 1"/>
+            <wp:cNvGraphicFramePr>
+              <a:graphicFrameLocks xmlns:a="http://schemas.openxmlformats.org/drawingml/2006/main" noChangeAspect="1"/>
+            </wp:cNvGraphicFramePr>
+            <a:graphic xmlns:a="http://schemas.openxmlformats.org/drawingml/2006/main">
+              <a:graphicData uri="http://schemas.openxmlformats.org/drawingml/2006/picture">
+                <pic:pic xmlns:pic="http://schemas.openxmlformats.org/drawingml/2006/picture">
+                  <pic:nvPicPr>
+                    <pic:cNvPr id="201152809" name=""/>
+                    <pic:cNvPicPr/>
+                  </pic:nvPicPr>
+                  <pic:blipFill>
+                    <a:blip r:embed="rId26"/>
+                    <a:stretch>
+                      <a:fillRect/>
+                    </a:stretch>
+                  </pic:blipFill>
+                  <pic:spPr>
+                    <a:xfrm>
+                      <a:off x="0" y="0"/>
+                      <a:ext cx="5731510" cy="1152525"/>
+                    </a:xfrm>
+                    <a:prstGeom prst="rect">
+                      <a:avLst/>
+                    </a:prstGeom>
+                  </pic:spPr>
+                </pic:pic>
+              </a:graphicData>
+            </a:graphic>
+          </wp:inline>
+        </w:drawing>
+      </w:r>
+    </w:p>
+    <w:p>
+      <w:pPr>
+        <w:pStyle w:val="ListParagraph"/>
+        <w:numPr>
+          <w:ilvl w:val="0"/>
+          <w:numId w:val="6"/>
+        </w:numPr>
+      </w:pPr>
+      <w:r>
+        <w:t>App (file location in C drive, and app output)</w:t>
+      </w:r>
+    </w:p>
+    <w:p>
+      <w:r>
+        <w:rPr>
+          <w:noProof/>
+        </w:rPr>
+        <w:drawing>
+          <wp:inline distT="0" distB="0" distL="0" distR="0" wp14:anchorId="227C51FF" wp14:editId="4F018EC5">
+            <wp:extent cx="5731510" cy="1360805"/>
+            <wp:effectExtent l="0" t="0" r="2540" b="0"/>
+            <wp:docPr id="1127823603" name="Picture 1"/>
+            <wp:cNvGraphicFramePr>
+              <a:graphicFrameLocks xmlns:a="http://schemas.openxmlformats.org/drawingml/2006/main" noChangeAspect="1"/>
+            </wp:cNvGraphicFramePr>
+            <a:graphic xmlns:a="http://schemas.openxmlformats.org/drawingml/2006/main">
+              <a:graphicData uri="http://schemas.openxmlformats.org/drawingml/2006/picture">
+                <pic:pic xmlns:pic="http://schemas.openxmlformats.org/drawingml/2006/picture">
+                  <pic:nvPicPr>
+                    <pic:cNvPr id="1127823603" name=""/>
+                    <pic:cNvPicPr/>
+                  </pic:nvPicPr>
+                  <pic:blipFill>
+                    <a:blip r:embed="rId27"/>
+                    <a:stretch>
+                      <a:fillRect/>
+                    </a:stretch>
+                  </pic:blipFill>
+                  <pic:spPr>
+                    <a:xfrm>
+                      <a:off x="0" y="0"/>
+                      <a:ext cx="5731510" cy="1360805"/>
+                    </a:xfrm>
+                    <a:prstGeom prst="rect">
+                      <a:avLst/>
+                    </a:prstGeom>
+                  </pic:spPr>
+                </pic:pic>
+              </a:graphicData>
+            </a:graphic>
+          </wp:inline>
+        </w:drawing>
+      </w:r>
+    </w:p>
+    <w:p>
+      <w:r>
+        <w:rPr>
+          <w:noProof/>
+        </w:rPr>
+        <w:drawing>
+          <wp:inline distT="0" distB="0" distL="0" distR="0" wp14:anchorId="4EBE4152" wp14:editId="7C5932DC">
+            <wp:extent cx="2813050" cy="2154189"/>
+            <wp:effectExtent l="0" t="0" r="6350" b="0"/>
+            <wp:docPr id="1509282410" name="Picture 1"/>
+            <wp:cNvGraphicFramePr>
+              <a:graphicFrameLocks xmlns:a="http://schemas.openxmlformats.org/drawingml/2006/main" noChangeAspect="1"/>
+            </wp:cNvGraphicFramePr>
+            <a:graphic xmlns:a="http://schemas.openxmlformats.org/drawingml/2006/main">
+              <a:graphicData uri="http://schemas.openxmlformats.org/drawingml/2006/picture">
+                <pic:pic xmlns:pic="http://schemas.openxmlformats.org/drawingml/2006/picture">
+                  <pic:nvPicPr>
+                    <pic:cNvPr id="1509282410" name=""/>
+                    <pic:cNvPicPr/>
+                  </pic:nvPicPr>
+                  <pic:blipFill>
+                    <a:blip r:embed="rId28"/>
+                    <a:stretch>
+                      <a:fillRect/>
+                    </a:stretch>
+                  </pic:blipFill>
+                  <pic:spPr>
+                    <a:xfrm>
+                      <a:off x="0" y="0"/>
+                      <a:ext cx="2817582" cy="2157659"/>
+                    </a:xfrm>
+                    <a:prstGeom prst="rect">
+                      <a:avLst/>
+                    </a:prstGeom>
+                  </pic:spPr>
+                </pic:pic>
+              </a:graphicData>
+            </a:graphic>
+          </wp:inline>
+        </w:drawing>
+      </w:r>
+    </w:p>
+    <w:p>
+      <w:pPr>
+        <w:pStyle w:val="Heading1"/>
+      </w:pPr>
+      <w:bookmarkStart w:id="2" w:name="_Toc238225776"/>
+      <w:r>
+        <w:t>1.3</w:t>
+      </w:r>
+      <w:r>
+        <w:t xml:space="preserve"> </w:t>
+      </w:r>
+      <w:r>
+        <w:tab/>
+      </w:r>
+      <w:r>
+        <w:t>Adding DLLs</w:t>
+      </w:r>
+      <w:bookmarkEnd w:id="2"/>
+      <w:r>
+        <w:t xml:space="preserve"> </w:t>
+      </w:r>
+    </w:p>
+    <w:p>
+      <w:r>
+        <w:t xml:space="preserve">for 1.3 </w:t>
+      </w:r>
+      <w:r>
+        <w:t xml:space="preserve">I created 2 libraries </w:t>
+      </w:r>
+      <w:r>
+        <w:t xml:space="preserve">and add into </w:t>
+      </w:r>
+      <w:r>
+        <w:t>the code from Task 1.2 (</w:t>
+      </w:r>
+      <w:proofErr w:type="spellStart"/>
+      <w:r>
+        <w:t>TextProcessorLibrary</w:t>
+      </w:r>
+      <w:proofErr w:type="spellEnd"/>
+      <w:r>
+        <w:t xml:space="preserve"> and </w:t>
+      </w:r>
+      <w:proofErr w:type="spellStart"/>
+      <w:r>
+        <w:t>TextProcessorsUtils</w:t>
+      </w:r>
+      <w:proofErr w:type="spellEnd"/>
+      <w:r>
+        <w:t>)</w:t>
+      </w:r>
+    </w:p>
+    <w:p>
+      <w:pPr>
+        <w:pStyle w:val="ListParagraph"/>
+        <w:numPr>
+          <w:ilvl w:val="0"/>
+          <w:numId w:val="1"/>
+        </w:numPr>
+      </w:pPr>
+      <w:proofErr w:type="spellStart"/>
+      <w:r>
+        <w:t>TextProcessorsLibrary</w:t>
+      </w:r>
+      <w:proofErr w:type="spellEnd"/>
+    </w:p>
+    <w:p>
+      <w:pPr>
+        <w:pStyle w:val="ListParagraph"/>
+        <w:numPr>
+          <w:ilvl w:val="0"/>
+          <w:numId w:val="2"/>
+        </w:numPr>
+      </w:pPr>
+      <w:r>
+        <w:t xml:space="preserve">Contains the </w:t>
+      </w:r>
+      <w:proofErr w:type="spellStart"/>
+      <w:r>
+        <w:t>WordCounter</w:t>
+      </w:r>
+      <w:proofErr w:type="spellEnd"/>
+      <w:r>
+        <w:t xml:space="preserve"> Class, which counts the number of words in the input text</w:t>
+      </w:r>
+    </w:p>
+    <w:p>
+      <w:pPr>
+        <w:pStyle w:val="ListParagraph"/>
+      </w:pPr>
+      <w:r>
+        <w:lastRenderedPageBreak/>
+        <w:drawing>
+          <wp:inline distT="0" distB="0" distL="0" distR="0" wp14:anchorId="2E0C80CC" wp14:editId="116EB09B">
+            <wp:extent cx="5731510" cy="1953260"/>
+            <wp:effectExtent l="0" t="0" r="2540" b="8890"/>
+            <wp:docPr id="944705339" name="Picture 1"/>
+            <wp:cNvGraphicFramePr>
+              <a:graphicFrameLocks xmlns:a="http://schemas.openxmlformats.org/drawingml/2006/main" noChangeAspect="1"/>
+            </wp:cNvGraphicFramePr>
+            <a:graphic xmlns:a="http://schemas.openxmlformats.org/drawingml/2006/main">
+              <a:graphicData uri="http://schemas.openxmlformats.org/drawingml/2006/picture">
+                <pic:pic xmlns:pic="http://schemas.openxmlformats.org/drawingml/2006/picture">
+                  <pic:nvPicPr>
+                    <pic:cNvPr id="944705339" name=""/>
+                    <pic:cNvPicPr/>
+                  </pic:nvPicPr>
+                  <pic:blipFill>
+                    <a:blip r:embed="rId29"/>
+                    <a:stretch>
+                      <a:fillRect/>
+                    </a:stretch>
+                  </pic:blipFill>
+                  <pic:spPr>
+                    <a:xfrm>
+                      <a:off x="0" y="0"/>
+                      <a:ext cx="5731510" cy="1953260"/>
+                    </a:xfrm>
+                    <a:prstGeom prst="rect">
+                      <a:avLst/>
+                    </a:prstGeom>
+                  </pic:spPr>
+                </pic:pic>
+              </a:graphicData>
+            </a:graphic>
+          </wp:inline>
+        </w:drawing>
+      </w:r>
+    </w:p>
+    <w:p>
+      <w:pPr>
+        <w:pStyle w:val="ListParagraph"/>
+      </w:pPr>
+      <w:r>
+        <w:drawing>
+          <wp:inline distT="0" distB="0" distL="0" distR="0" wp14:anchorId="51DCCD5E" wp14:editId="3A1CA3E0">
+            <wp:extent cx="5731510" cy="518795"/>
+            <wp:effectExtent l="0" t="0" r="2540" b="0"/>
+            <wp:docPr id="184457103" name="Picture 1"/>
+            <wp:cNvGraphicFramePr>
+              <a:graphicFrameLocks xmlns:a="http://schemas.openxmlformats.org/drawingml/2006/main" noChangeAspect="1"/>
+            </wp:cNvGraphicFramePr>
+            <a:graphic xmlns:a="http://schemas.openxmlformats.org/drawingml/2006/main">
+              <a:graphicData uri="http://schemas.openxmlformats.org/drawingml/2006/picture">
+                <pic:pic xmlns:pic="http://schemas.openxmlformats.org/drawingml/2006/picture">
+                  <pic:nvPicPr>
+                    <pic:cNvPr id="184457103" name=""/>
+                    <pic:cNvPicPr/>
+                  </pic:nvPicPr>
+                  <pic:blipFill>
+                    <a:blip r:embed="rId30"/>
+                    <a:stretch>
+                      <a:fillRect/>
+                    </a:stretch>
+                  </pic:blipFill>
+                  <pic:spPr>
+                    <a:xfrm>
+                      <a:off x="0" y="0"/>
+                      <a:ext cx="5731510" cy="518795"/>
+                    </a:xfrm>
+                    <a:prstGeom prst="rect">
+                      <a:avLst/>
+                    </a:prstGeom>
+                  </pic:spPr>
+                </pic:pic>
+              </a:graphicData>
+            </a:graphic>
+          </wp:inline>
+        </w:drawing>
+      </w:r>
+    </w:p>
+    <w:p>
+      <w:pPr>
+        <w:pStyle w:val="ListParagraph"/>
+        <w:numPr>
+          <w:ilvl w:val="0"/>
+          <w:numId w:val="1"/>
+        </w:numPr>
+      </w:pPr>
+      <w:proofErr w:type="spellStart"/>
+      <w:r>
+        <w:t>TextProcessorsUtils</w:t>
+      </w:r>
+      <w:proofErr w:type="spellEnd"/>
+    </w:p>
+    <w:p>
+      <w:pPr>
+        <w:pStyle w:val="ListParagraph"/>
+        <w:numPr>
+          <w:ilvl w:val="0"/>
+          <w:numId w:val="2"/>
+        </w:numPr>
+      </w:pPr>
+      <w:r>
+        <w:t xml:space="preserve">Contains the </w:t>
+      </w:r>
+      <w:proofErr w:type="spellStart"/>
+      <w:r>
+        <w:t>TextValidator</w:t>
+      </w:r>
+      <w:proofErr w:type="spellEnd"/>
+      <w:r>
+        <w:t xml:space="preserve"> class, which validates that the user has entered valid text before counting.</w:t>
+      </w:r>
+    </w:p>
+    <w:p>
+      <w:pPr>
+        <w:pStyle w:val="ListParagraph"/>
+      </w:pPr>
+      <w:r>
+        <w:drawing>
+          <wp:inline distT="0" distB="0" distL="0" distR="0" wp14:anchorId="3DE3AD67" wp14:editId="7522D512">
+            <wp:extent cx="5731510" cy="1910080"/>
+            <wp:effectExtent l="0" t="0" r="2540" b="0"/>
+            <wp:docPr id="562406150" name="Picture 1"/>
+            <wp:cNvGraphicFramePr>
+              <a:graphicFrameLocks xmlns:a="http://schemas.openxmlformats.org/drawingml/2006/main" noChangeAspect="1"/>
+            </wp:cNvGraphicFramePr>
+            <a:graphic xmlns:a="http://schemas.openxmlformats.org/drawingml/2006/main">
+              <a:graphicData uri="http://schemas.openxmlformats.org/drawingml/2006/picture">
+                <pic:pic xmlns:pic="http://schemas.openxmlformats.org/drawingml/2006/picture">
+                  <pic:nvPicPr>
+                    <pic:cNvPr id="562406150" name=""/>
+                    <pic:cNvPicPr/>
+                  </pic:nvPicPr>
+                  <pic:blipFill>
+                    <a:blip r:embed="rId31"/>
+                    <a:stretch>
+                      <a:fillRect/>
+                    </a:stretch>
+                  </pic:blipFill>
+                  <pic:spPr>
+                    <a:xfrm>
+                      <a:off x="0" y="0"/>
+                      <a:ext cx="5731510" cy="1910080"/>
+                    </a:xfrm>
+                    <a:prstGeom prst="rect">
+                      <a:avLst/>
+                    </a:prstGeom>
+                  </pic:spPr>
+                </pic:pic>
+              </a:graphicData>
+            </a:graphic>
+          </wp:inline>
+        </w:drawing>
+      </w:r>
+    </w:p>
+    <w:p>
+      <w:pPr>
+        <w:pStyle w:val="ListParagraph"/>
+      </w:pPr>
+      <w:r>
+        <w:drawing>
+          <wp:inline distT="0" distB="0" distL="0" distR="0" wp14:anchorId="2BBB9B6B" wp14:editId="574622A6">
+            <wp:extent cx="5572903" cy="857370"/>
+            <wp:effectExtent l="0" t="0" r="0" b="0"/>
+            <wp:docPr id="1756410004" name="Picture 1"/>
+            <wp:cNvGraphicFramePr>
+              <a:graphicFrameLocks xmlns:a="http://schemas.openxmlformats.org/drawingml/2006/main" noChangeAspect="1"/>
+            </wp:cNvGraphicFramePr>
+            <a:graphic xmlns:a="http://schemas.openxmlformats.org/drawingml/2006/main">
+              <a:graphicData uri="http://schemas.openxmlformats.org/drawingml/2006/picture">
+                <pic:pic xmlns:pic="http://schemas.openxmlformats.org/drawingml/2006/picture">
+                  <pic:nvPicPr>
+                    <pic:cNvPr id="1756410004" name=""/>
+                    <pic:cNvPicPr/>
+                  </pic:nvPicPr>
+                  <pic:blipFill>
+                    <a:blip r:embed="rId32"/>
+                    <a:stretch>
+                      <a:fillRect/>
+                    </a:stretch>
+                  </pic:blipFill>
+                  <pic:spPr>
+                    <a:xfrm>
+                      <a:off x="0" y="0"/>
+                      <a:ext cx="5572903" cy="857370"/>
+                    </a:xfrm>
+                    <a:prstGeom prst="rect">
+                      <a:avLst/>
+                    </a:prstGeom>
+                  </pic:spPr>
+                </pic:pic>
+              </a:graphicData>
+            </a:graphic>
+          </wp:inline>
+        </w:drawing>
+      </w:r>
+    </w:p>
+    <w:p>
+      <w:pPr>
+        <w:pStyle w:val="ListParagraph"/>
+        <w:numPr>
+          <w:ilvl w:val="0"/>
+          <w:numId w:val="1"/>
+        </w:numPr>
+      </w:pPr>
+      <w:r>
+        <w:t xml:space="preserve">Updated Form1.cs </w:t>
+      </w:r>
+    </w:p>
+    <w:p>
+      <w:pPr>
+        <w:pStyle w:val="ListParagraph"/>
+      </w:pPr>
+      <w:r>
+        <w:lastRenderedPageBreak/>
+        <w:drawing>
+          <wp:inline distT="0" distB="0" distL="0" distR="0" wp14:anchorId="782FC76D" wp14:editId="123ABC34">
+            <wp:extent cx="4005865" cy="5543550"/>
+            <wp:effectExtent l="0" t="0" r="0" b="0"/>
+            <wp:docPr id="1207178048" name="Picture 1"/>
+            <wp:cNvGraphicFramePr>
+              <a:graphicFrameLocks xmlns:a="http://schemas.openxmlformats.org/drawingml/2006/main" noChangeAspect="1"/>
+            </wp:cNvGraphicFramePr>
+            <a:graphic xmlns:a="http://schemas.openxmlformats.org/drawingml/2006/main">
+              <a:graphicData uri="http://schemas.openxmlformats.org/drawingml/2006/picture">
+                <pic:pic xmlns:pic="http://schemas.openxmlformats.org/drawingml/2006/picture">
+                  <pic:nvPicPr>
+                    <pic:cNvPr id="1207178048" name=""/>
+                    <pic:cNvPicPr/>
+                  </pic:nvPicPr>
+                  <pic:blipFill>
+                    <a:blip r:embed="rId33"/>
+                    <a:stretch>
+                      <a:fillRect/>
+                    </a:stretch>
+                  </pic:blipFill>
+                  <pic:spPr>
+                    <a:xfrm>
+                      <a:off x="0" y="0"/>
+                      <a:ext cx="4008881" cy="5547724"/>
+                    </a:xfrm>
+                    <a:prstGeom prst="rect">
+                      <a:avLst/>
+                    </a:prstGeom>
+                  </pic:spPr>
+                </pic:pic>
+              </a:graphicData>
+            </a:graphic>
+          </wp:inline>
+        </w:drawing>
+      </w:r>
+    </w:p>
+    <w:p>
+      <w:pPr>
+        <w:pStyle w:val="ListParagraph"/>
+      </w:pPr>
+      <w:r>
+        <w:drawing>
+          <wp:inline distT="0" distB="0" distL="0" distR="0" wp14:anchorId="4F907044" wp14:editId="6C97757A">
+            <wp:extent cx="4219575" cy="2994281"/>
+            <wp:effectExtent l="0" t="0" r="0" b="0"/>
+            <wp:docPr id="757088324" name="Picture 1"/>
+            <wp:cNvGraphicFramePr>
+              <a:graphicFrameLocks xmlns:a="http://schemas.openxmlformats.org/drawingml/2006/main" noChangeAspect="1"/>
+            </wp:cNvGraphicFramePr>
+            <a:graphic xmlns:a="http://schemas.openxmlformats.org/drawingml/2006/main">
+              <a:graphicData uri="http://schemas.openxmlformats.org/drawingml/2006/picture">
+                <pic:pic xmlns:pic="http://schemas.openxmlformats.org/drawingml/2006/picture">
+                  <pic:nvPicPr>
+                    <pic:cNvPr id="757088324" name=""/>
+                    <pic:cNvPicPr/>
+                  </pic:nvPicPr>
+                  <pic:blipFill>
+                    <a:blip r:embed="rId34"/>
+                    <a:stretch>
+                      <a:fillRect/>
+                    </a:stretch>
+                  </pic:blipFill>
+                  <pic:spPr>
+                    <a:xfrm>
+                      <a:off x="0" y="0"/>
+                      <a:ext cx="4220367" cy="2994843"/>
+                    </a:xfrm>
+                    <a:prstGeom prst="rect">
+                      <a:avLst/>
+                    </a:prstGeom>
+                  </pic:spPr>
+                </pic:pic>
+              </a:graphicData>
+            </a:graphic>
+          </wp:inline>
+        </w:drawing>
+      </w:r>
+    </w:p>
+    <w:p>
+      <w:pPr>
+        <w:pStyle w:val="ListParagraph"/>
+      </w:pPr>
+      <w:r>
+        <w:lastRenderedPageBreak/>
+        <w:drawing>
+          <wp:inline distT="0" distB="0" distL="0" distR="0" wp14:anchorId="3339D6E6" wp14:editId="73F134A5">
+            <wp:extent cx="5731510" cy="1044575"/>
+            <wp:effectExtent l="0" t="0" r="2540" b="3175"/>
+            <wp:docPr id="1511225273" name="Picture 1"/>
+            <wp:cNvGraphicFramePr>
+              <a:graphicFrameLocks xmlns:a="http://schemas.openxmlformats.org/drawingml/2006/main" noChangeAspect="1"/>
+            </wp:cNvGraphicFramePr>
+            <a:graphic xmlns:a="http://schemas.openxmlformats.org/drawingml/2006/main">
+              <a:graphicData uri="http://schemas.openxmlformats.org/drawingml/2006/picture">
+                <pic:pic xmlns:pic="http://schemas.openxmlformats.org/drawingml/2006/picture">
+                  <pic:nvPicPr>
+                    <pic:cNvPr id="1511225273" name=""/>
+                    <pic:cNvPicPr/>
+                  </pic:nvPicPr>
+                  <pic:blipFill>
+                    <a:blip r:embed="rId35"/>
+                    <a:stretch>
+                      <a:fillRect/>
+                    </a:stretch>
+                  </pic:blipFill>
+                  <pic:spPr>
+                    <a:xfrm>
+                      <a:off x="0" y="0"/>
+                      <a:ext cx="5731510" cy="1044575"/>
+                    </a:xfrm>
+                    <a:prstGeom prst="rect">
+                      <a:avLst/>
+                    </a:prstGeom>
+                  </pic:spPr>
+                </pic:pic>
+              </a:graphicData>
+            </a:graphic>
+          </wp:inline>
+        </w:drawing>
+      </w:r>
+    </w:p>
+    <w:p>
+      <w:pPr>
+        <w:pStyle w:val="ListParagraph"/>
+        <w:numPr>
+          <w:ilvl w:val="0"/>
+          <w:numId w:val="1"/>
+        </w:numPr>
+      </w:pPr>
+      <w:r>
+        <w:t>Setup</w:t>
+      </w:r>
+    </w:p>
+    <w:p>
+      <w:pPr>
+        <w:pStyle w:val="ListParagraph"/>
+      </w:pPr>
+      <w:r>
+        <w:drawing>
+          <wp:inline distT="0" distB="0" distL="0" distR="0" wp14:anchorId="2A61C34F" wp14:editId="7A4245C9">
+            <wp:extent cx="5731510" cy="2759075"/>
+            <wp:effectExtent l="0" t="0" r="2540" b="3175"/>
+            <wp:docPr id="1522602717" name="Picture 1"/>
+            <wp:cNvGraphicFramePr>
+              <a:graphicFrameLocks xmlns:a="http://schemas.openxmlformats.org/drawingml/2006/main" noChangeAspect="1"/>
+            </wp:cNvGraphicFramePr>
+            <a:graphic xmlns:a="http://schemas.openxmlformats.org/drawingml/2006/main">
+              <a:graphicData uri="http://schemas.openxmlformats.org/drawingml/2006/picture">
+                <pic:pic xmlns:pic="http://schemas.openxmlformats.org/drawingml/2006/picture">
+                  <pic:nvPicPr>
+                    <pic:cNvPr id="1522602717" name=""/>
+                    <pic:cNvPicPr/>
+                  </pic:nvPicPr>
+                  <pic:blipFill>
+                    <a:blip r:embed="rId36"/>
+                    <a:stretch>
+                      <a:fillRect/>
+                    </a:stretch>
+                  </pic:blipFill>
+                  <pic:spPr>
+                    <a:xfrm>
+                      <a:off x="0" y="0"/>
+                      <a:ext cx="5731510" cy="2759075"/>
+                    </a:xfrm>
+                    <a:prstGeom prst="rect">
+                      <a:avLst/>
+                    </a:prstGeom>
+                  </pic:spPr>
+                </pic:pic>
+              </a:graphicData>
+            </a:graphic>
+          </wp:inline>
+        </w:drawing>
+      </w:r>
+    </w:p>
+    <w:p>
+      <w:pPr>
+        <w:pStyle w:val="ListParagraph"/>
+      </w:pPr>
+      <w:r>
+        <w:drawing>
+          <wp:inline distT="0" distB="0" distL="0" distR="0" wp14:anchorId="2BDEECAF" wp14:editId="569695C8">
+            <wp:extent cx="5731510" cy="525145"/>
+            <wp:effectExtent l="0" t="0" r="2540" b="8255"/>
+            <wp:docPr id="1537758315" name="Picture 1"/>
+            <wp:cNvGraphicFramePr>
+              <a:graphicFrameLocks xmlns:a="http://schemas.openxmlformats.org/drawingml/2006/main" noChangeAspect="1"/>
+            </wp:cNvGraphicFramePr>
+            <a:graphic xmlns:a="http://schemas.openxmlformats.org/drawingml/2006/main">
+              <a:graphicData uri="http://schemas.openxmlformats.org/drawingml/2006/picture">
+                <pic:pic xmlns:pic="http://schemas.openxmlformats.org/drawingml/2006/picture">
+                  <pic:nvPicPr>
+                    <pic:cNvPr id="1537758315" name=""/>
+                    <pic:cNvPicPr/>
+                  </pic:nvPicPr>
+                  <pic:blipFill>
+                    <a:blip r:embed="rId37"/>
+                    <a:stretch>
+                      <a:fillRect/>
+                    </a:stretch>
+                  </pic:blipFill>
+                  <pic:spPr>
+                    <a:xfrm>
+                      <a:off x="0" y="0"/>
+                      <a:ext cx="5731510" cy="525145"/>
+                    </a:xfrm>
+                    <a:prstGeom prst="rect">
+                      <a:avLst/>
+                    </a:prstGeom>
+                  </pic:spPr>
+                </pic:pic>
+              </a:graphicData>
+            </a:graphic>
+          </wp:inline>
+        </w:drawing>
+      </w:r>
+    </w:p>
+    <w:p>
+      <w:pPr>
+        <w:pStyle w:val="ListParagraph"/>
+        <w:numPr>
+          <w:ilvl w:val="0"/>
+          <w:numId w:val="1"/>
+        </w:numPr>
+      </w:pPr>
+      <w:r>
+        <w:t>Output</w:t>
+      </w:r>
+    </w:p>
+    <w:p>
+      <w:pPr>
+        <w:pStyle w:val="ListParagraph"/>
+      </w:pPr>
+      <w:r>
+        <w:t>Download the application</w:t>
+      </w:r>
+    </w:p>
+    <w:p>
+      <w:pPr>
+        <w:pStyle w:val="ListParagraph"/>
+      </w:pPr>
+      <w:r>
+        <w:drawing>
+          <wp:inline distT="0" distB="0" distL="0" distR="0" wp14:anchorId="4EEDEF6A" wp14:editId="0E8A6AA8">
+            <wp:extent cx="5731510" cy="984885"/>
+            <wp:effectExtent l="0" t="0" r="2540" b="5715"/>
+            <wp:docPr id="1158656063" name="Picture 1"/>
+            <wp:cNvGraphicFramePr>
+              <a:graphicFrameLocks xmlns:a="http://schemas.openxmlformats.org/drawingml/2006/main" noChangeAspect="1"/>
+            </wp:cNvGraphicFramePr>
+            <a:graphic xmlns:a="http://schemas.openxmlformats.org/drawingml/2006/main">
+              <a:graphicData uri="http://schemas.openxmlformats.org/drawingml/2006/picture">
+                <pic:pic xmlns:pic="http://schemas.openxmlformats.org/drawingml/2006/picture">
+                  <pic:nvPicPr>
+                    <pic:cNvPr id="1158656063" name=""/>
+                    <pic:cNvPicPr/>
+                  </pic:nvPicPr>
+                  <pic:blipFill>
+                    <a:blip r:embed="rId38"/>
+                    <a:stretch>
+                      <a:fillRect/>
+                    </a:stretch>
+                  </pic:blipFill>
+                  <pic:spPr>
+                    <a:xfrm>
+                      <a:off x="0" y="0"/>
+                      <a:ext cx="5731510" cy="984885"/>
+                    </a:xfrm>
+                    <a:prstGeom prst="rect">
+                      <a:avLst/>
+                    </a:prstGeom>
+                  </pic:spPr>
+                </pic:pic>
+              </a:graphicData>
+            </a:graphic>
+          </wp:inline>
+        </w:drawing>
+      </w:r>
+    </w:p>
+    <w:p>
+      <w:pPr>
+        <w:pStyle w:val="ListParagraph"/>
+      </w:pPr>
+      <w:r>
+        <w:drawing>
+          <wp:inline distT="0" distB="0" distL="0" distR="0" wp14:anchorId="660A84CB" wp14:editId="3C955DED">
+            <wp:extent cx="3629532" cy="2724530"/>
+            <wp:effectExtent l="0" t="0" r="9525" b="0"/>
+            <wp:docPr id="1038813908" name="Picture 1"/>
+            <wp:cNvGraphicFramePr>
+              <a:graphicFrameLocks xmlns:a="http://schemas.openxmlformats.org/drawingml/2006/main" noChangeAspect="1"/>
+            </wp:cNvGraphicFramePr>
+            <a:graphic xmlns:a="http://schemas.openxmlformats.org/drawingml/2006/main">
+              <a:graphicData uri="http://schemas.openxmlformats.org/drawingml/2006/picture">
+                <pic:pic xmlns:pic="http://schemas.openxmlformats.org/drawingml/2006/picture">
+                  <pic:nvPicPr>
+                    <pic:cNvPr id="1038813908" name=""/>
+                    <pic:cNvPicPr/>
+                  </pic:nvPicPr>
+                  <pic:blipFill>
+                    <a:blip r:embed="rId39"/>
+                    <a:stretch>
+                      <a:fillRect/>
+                    </a:stretch>
+                  </pic:blipFill>
+                  <pic:spPr>
+                    <a:xfrm>
+                      <a:off x="0" y="0"/>
+                      <a:ext cx="3629532" cy="2724530"/>
+                    </a:xfrm>
+                    <a:prstGeom prst="rect">
+                      <a:avLst/>
+                    </a:prstGeom>
+                  </pic:spPr>
+                </pic:pic>
+              </a:graphicData>
+            </a:graphic>
+          </wp:inline>
+        </w:drawing>
+      </w:r>
+    </w:p>
+    <w:p>
+      <w:pPr>
+        <w:pStyle w:val="ListParagraph"/>
+      </w:pPr>
+      <w:r>
+        <w:lastRenderedPageBreak/>
+        <w:drawing>
+          <wp:inline distT="0" distB="0" distL="0" distR="0" wp14:anchorId="01230CEE" wp14:editId="312EE8B2">
+            <wp:extent cx="5731510" cy="1916430"/>
+            <wp:effectExtent l="0" t="0" r="2540" b="7620"/>
+            <wp:docPr id="906853053" name="Picture 1"/>
+            <wp:cNvGraphicFramePr>
+              <a:graphicFrameLocks xmlns:a="http://schemas.openxmlformats.org/drawingml/2006/main" noChangeAspect="1"/>
+            </wp:cNvGraphicFramePr>
+            <a:graphic xmlns:a="http://schemas.openxmlformats.org/drawingml/2006/main">
+              <a:graphicData uri="http://schemas.openxmlformats.org/drawingml/2006/picture">
+                <pic:pic xmlns:pic="http://schemas.openxmlformats.org/drawingml/2006/picture">
+                  <pic:nvPicPr>
+                    <pic:cNvPr id="906853053" name=""/>
+                    <pic:cNvPicPr/>
+                  </pic:nvPicPr>
+                  <pic:blipFill>
+                    <a:blip r:embed="rId40"/>
+                    <a:stretch>
+                      <a:fillRect/>
+                    </a:stretch>
+                  </pic:blipFill>
+                  <pic:spPr>
+                    <a:xfrm>
+                      <a:off x="0" y="0"/>
+                      <a:ext cx="5731510" cy="1916430"/>
+                    </a:xfrm>
+                    <a:prstGeom prst="rect">
+                      <a:avLst/>
+                    </a:prstGeom>
+                  </pic:spPr>
+                </pic:pic>
+              </a:graphicData>
+            </a:graphic>
+          </wp:inline>
+        </w:drawing>
+      </w:r>
+    </w:p>
+    <w:p>
+      <w:pPr>
+        <w:pStyle w:val="ListParagraph"/>
+      </w:pPr>
+    </w:p>
+    <w:p>
+      <w:pPr>
+        <w:pStyle w:val="ListParagraph"/>
+        <w:ind w:left="709"/>
+      </w:pPr>
+      <w:r>
+        <w:t>In this 1.3 I also clean before building it again to deletes all the old compiled files</w:t>
+      </w:r>
+      <w:r>
+        <w:t xml:space="preserve"> </w:t>
+      </w:r>
+      <w:r>
+        <w:t>from the previous build; and also delete the app from the previous download</w:t>
+      </w:r>
+    </w:p>
+    <w:p>
+      <w:pPr>
+        <w:pStyle w:val="ListParagraph"/>
+      </w:pPr>
+      <w:r>
+        <w:drawing>
+          <wp:inline distT="0" distB="0" distL="0" distR="0" wp14:anchorId="2D70C128" wp14:editId="5EFBB064">
+            <wp:extent cx="5731510" cy="1199515"/>
+            <wp:effectExtent l="0" t="0" r="2540" b="635"/>
+            <wp:docPr id="1991646962" name="Picture 1"/>
+            <wp:cNvGraphicFramePr>
+              <a:graphicFrameLocks xmlns:a="http://schemas.openxmlformats.org/drawingml/2006/main" noChangeAspect="1"/>
+            </wp:cNvGraphicFramePr>
+            <a:graphic xmlns:a="http://schemas.openxmlformats.org/drawingml/2006/main">
+              <a:graphicData uri="http://schemas.openxmlformats.org/drawingml/2006/picture">
+                <pic:pic xmlns:pic="http://schemas.openxmlformats.org/drawingml/2006/picture">
+                  <pic:nvPicPr>
+                    <pic:cNvPr id="1991646962" name=""/>
+                    <pic:cNvPicPr/>
+                  </pic:nvPicPr>
+                  <pic:blipFill>
+                    <a:blip r:embed="rId41"/>
+                    <a:stretch>
+                      <a:fillRect/>
+                    </a:stretch>
+                  </pic:blipFill>
+                  <pic:spPr>
+                    <a:xfrm>
+                      <a:off x="0" y="0"/>
+                      <a:ext cx="5731510" cy="1199515"/>
+                    </a:xfrm>
+                    <a:prstGeom prst="rect">
+                      <a:avLst/>
+                    </a:prstGeom>
+                  </pic:spPr>
+                </pic:pic>
+              </a:graphicData>
+            </a:graphic>
+          </wp:inline>
+        </w:drawing>
+      </w:r>
+    </w:p>
+    <w:p>
+      <w:pPr>
+        <w:pStyle w:val="ListParagraph"/>
+      </w:pPr>
+      <w:r>
+        <w:drawing>
+          <wp:inline distT="0" distB="0" distL="0" distR="0" wp14:anchorId="4A9AE1E4" wp14:editId="48952916">
+            <wp:extent cx="5731510" cy="1722120"/>
+            <wp:effectExtent l="0" t="0" r="2540" b="0"/>
+            <wp:docPr id="533463386" name="Picture 1"/>
+            <wp:cNvGraphicFramePr>
+              <a:graphicFrameLocks xmlns:a="http://schemas.openxmlformats.org/drawingml/2006/main" noChangeAspect="1"/>
+            </wp:cNvGraphicFramePr>
+            <a:graphic xmlns:a="http://schemas.openxmlformats.org/drawingml/2006/main">
+              <a:graphicData uri="http://schemas.openxmlformats.org/drawingml/2006/picture">
+                <pic:pic xmlns:pic="http://schemas.openxmlformats.org/drawingml/2006/picture">
+                  <pic:nvPicPr>
+                    <pic:cNvPr id="533463386" name=""/>
+                    <pic:cNvPicPr/>
+                  </pic:nvPicPr>
+                  <pic:blipFill>
+                    <a:blip r:embed="rId42"/>
+                    <a:stretch>
+                      <a:fillRect/>
+                    </a:stretch>
+                  </pic:blipFill>
+                  <pic:spPr>
+                    <a:xfrm>
+                      <a:off x="0" y="0"/>
+                      <a:ext cx="5731510" cy="1722120"/>
+                    </a:xfrm>
+                    <a:prstGeom prst="rect">
+                      <a:avLst/>
+                    </a:prstGeom>
+                  </pic:spPr>
+                </pic:pic>
+              </a:graphicData>
+            </a:graphic>
+          </wp:inline>
+        </w:drawing>
+      </w:r>
+    </w:p>
+    <w:p>
+      <w:pPr>
+        <w:pStyle w:val="Heading1"/>
+      </w:pPr>
+      <w:bookmarkStart w:id="3" w:name="_Toc238225777"/>
+      <w:r>
+        <w:t xml:space="preserve">1.4 </w:t>
+      </w:r>
+      <w:r>
+        <w:tab/>
+      </w:r>
+      <w:r>
+        <w:t xml:space="preserve">GitHub Release + </w:t>
+      </w:r>
+      <w:proofErr w:type="spellStart"/>
+      <w:r>
+        <w:t>WinGet</w:t>
+      </w:r>
+      <w:bookmarkEnd w:id="3"/>
+      <w:proofErr w:type="spellEnd"/>
+    </w:p>
+    <w:p>
+      <w:r>
+        <w:t>For 1.4 we will be releasing the code on Git</w:t>
+      </w:r>
+      <w:r>
+        <w:t>H</w:t>
+      </w:r>
+      <w:r>
+        <w:t>ub</w:t>
+      </w:r>
+      <w:r>
+        <w:t xml:space="preserve"> and create a manifest on </w:t>
+      </w:r>
+      <w:proofErr w:type="spellStart"/>
+      <w:r>
+        <w:t>WinGet</w:t>
+      </w:r>
+      <w:proofErr w:type="spellEnd"/>
+    </w:p>
+    <w:p>
+      <w:r>
+        <w:t>Step by step</w:t>
+      </w:r>
+      <w:r>
+        <w:t xml:space="preserve"> </w:t>
+      </w:r>
+    </w:p>
+    <w:p>
+      <w:pPr>
+        <w:pStyle w:val="ListParagraph"/>
+        <w:numPr>
+          <w:ilvl w:val="0"/>
+          <w:numId w:val="7"/>
+        </w:numPr>
+      </w:pPr>
+      <w:r>
+        <w:t>Create GitHub release</w:t>
+      </w:r>
+    </w:p>
+    <w:p>
+      <w:pPr>
+        <w:pStyle w:val="ListParagraph"/>
+        <w:numPr>
+          <w:ilvl w:val="0"/>
+          <w:numId w:val="2"/>
+        </w:numPr>
+      </w:pPr>
+      <w:r>
+        <w:t>Go to GitHub repository, on the right side click on release, click on create a new release, select your file, publish release</w:t>
+      </w:r>
+    </w:p>
+    <w:p>
+      <w:r>
+        <w:lastRenderedPageBreak/>
+        <w:drawing>
+          <wp:inline distT="0" distB="0" distL="0" distR="0" wp14:anchorId="6B01A772" wp14:editId="3016E0BF">
+            <wp:extent cx="4468633" cy="4585473"/>
+            <wp:effectExtent l="0" t="0" r="8255" b="5715"/>
+            <wp:docPr id="250335057" name="Picture 1"/>
+            <wp:cNvGraphicFramePr>
+              <a:graphicFrameLocks xmlns:a="http://schemas.openxmlformats.org/drawingml/2006/main" noChangeAspect="1"/>
+            </wp:cNvGraphicFramePr>
+            <a:graphic xmlns:a="http://schemas.openxmlformats.org/drawingml/2006/main">
+              <a:graphicData uri="http://schemas.openxmlformats.org/drawingml/2006/picture">
+                <pic:pic xmlns:pic="http://schemas.openxmlformats.org/drawingml/2006/picture">
+                  <pic:nvPicPr>
+                    <pic:cNvPr id="250335057" name=""/>
+                    <pic:cNvPicPr/>
+                  </pic:nvPicPr>
+                  <pic:blipFill>
+                    <a:blip r:embed="rId43"/>
+                    <a:stretch>
+                      <a:fillRect/>
+                    </a:stretch>
+                  </pic:blipFill>
+                  <pic:spPr>
+                    <a:xfrm>
+                      <a:off x="0" y="0"/>
+                      <a:ext cx="4469756" cy="4586625"/>
+                    </a:xfrm>
+                    <a:prstGeom prst="rect">
+                      <a:avLst/>
+                    </a:prstGeom>
+                  </pic:spPr>
+                </pic:pic>
+              </a:graphicData>
+            </a:graphic>
+          </wp:inline>
+        </w:drawing>
+      </w:r>
+      <w:r>
+        <w:br/>
+      </w:r>
+      <w:r>
+        <w:drawing>
+          <wp:inline distT="0" distB="0" distL="0" distR="0" wp14:anchorId="71EE88C5" wp14:editId="761972BA">
+            <wp:extent cx="4436828" cy="2029655"/>
+            <wp:effectExtent l="0" t="0" r="1905" b="8890"/>
+            <wp:docPr id="987109569" name="Picture 1"/>
+            <wp:cNvGraphicFramePr>
+              <a:graphicFrameLocks xmlns:a="http://schemas.openxmlformats.org/drawingml/2006/main" noChangeAspect="1"/>
+            </wp:cNvGraphicFramePr>
+            <a:graphic xmlns:a="http://schemas.openxmlformats.org/drawingml/2006/main">
+              <a:graphicData uri="http://schemas.openxmlformats.org/drawingml/2006/picture">
+                <pic:pic xmlns:pic="http://schemas.openxmlformats.org/drawingml/2006/picture">
+                  <pic:nvPicPr>
+                    <pic:cNvPr id="987109569" name=""/>
+                    <pic:cNvPicPr/>
+                  </pic:nvPicPr>
+                  <pic:blipFill>
+                    <a:blip r:embed="rId44"/>
+                    <a:stretch>
+                      <a:fillRect/>
+                    </a:stretch>
+                  </pic:blipFill>
+                  <pic:spPr>
+                    <a:xfrm>
+                      <a:off x="0" y="0"/>
+                      <a:ext cx="4441047" cy="2031585"/>
+                    </a:xfrm>
+                    <a:prstGeom prst="rect">
+                      <a:avLst/>
+                    </a:prstGeom>
+                  </pic:spPr>
+                </pic:pic>
+              </a:graphicData>
+            </a:graphic>
+          </wp:inline>
+        </w:drawing>
+      </w:r>
+    </w:p>
+    <w:p>
+      <w:pPr>
+        <w:pStyle w:val="ListParagraph"/>
+        <w:numPr>
+          <w:ilvl w:val="0"/>
+          <w:numId w:val="7"/>
+        </w:numPr>
+      </w:pPr>
+      <w:r>
+        <w:t>Get the SHA</w:t>
+      </w:r>
+      <w:r>
+        <w:t xml:space="preserve">, keep it, will need for the manifest file </w:t>
+      </w:r>
+    </w:p>
+    <w:p>
+      <w:r>
+        <w:t>(</w:t>
+      </w:r>
+      <w:r>
+        <w:t>sha</w:t>
+      </w:r>
+      <w:proofErr w:type="gramStart"/>
+      <w:r>
+        <w:t>256:e</w:t>
+      </w:r>
+      <w:proofErr w:type="gramEnd"/>
+      <w:r>
+        <w:t>6414e46a486037f22305f127ea95c7e0bedd9f396d498f5df766e734e9bffd8</w:t>
+      </w:r>
+      <w:r>
+        <w:t>)</w:t>
+      </w:r>
+    </w:p>
+    <w:p>
+      <w:pPr>
+        <w:pStyle w:val="ListParagraph"/>
+        <w:numPr>
+          <w:ilvl w:val="0"/>
+          <w:numId w:val="7"/>
+        </w:numPr>
+      </w:pPr>
+      <w:r>
+        <w:t>Create Manifest</w:t>
+      </w:r>
+      <w:r>
+        <w:t xml:space="preserve"> (</w:t>
+      </w:r>
+      <w:proofErr w:type="gramStart"/>
+      <w:r>
+        <w:t>the .</w:t>
+      </w:r>
+      <w:proofErr w:type="spellStart"/>
+      <w:r>
+        <w:t>yaml</w:t>
+      </w:r>
+      <w:proofErr w:type="spellEnd"/>
+      <w:proofErr w:type="gramEnd"/>
+      <w:r>
+        <w:t xml:space="preserve"> content)</w:t>
+      </w:r>
+      <w:r>
+        <w:t>, and put in the sha in InstallerSha256</w:t>
+      </w:r>
+    </w:p>
+    <w:p>
+      <w:r>
+        <w:lastRenderedPageBreak/>
+        <w:drawing>
+          <wp:inline distT="0" distB="0" distL="0" distR="0" wp14:anchorId="1F30782E" wp14:editId="6D13D999">
+            <wp:extent cx="4969565" cy="3400403"/>
+            <wp:effectExtent l="0" t="0" r="2540" b="0"/>
+            <wp:docPr id="1879409782" name="Picture 1"/>
+            <wp:cNvGraphicFramePr>
+              <a:graphicFrameLocks xmlns:a="http://schemas.openxmlformats.org/drawingml/2006/main" noChangeAspect="1"/>
+            </wp:cNvGraphicFramePr>
+            <a:graphic xmlns:a="http://schemas.openxmlformats.org/drawingml/2006/main">
+              <a:graphicData uri="http://schemas.openxmlformats.org/drawingml/2006/picture">
+                <pic:pic xmlns:pic="http://schemas.openxmlformats.org/drawingml/2006/picture">
+                  <pic:nvPicPr>
+                    <pic:cNvPr id="1879409782" name=""/>
+                    <pic:cNvPicPr/>
+                  </pic:nvPicPr>
+                  <pic:blipFill>
+                    <a:blip r:embed="rId45"/>
+                    <a:stretch>
+                      <a:fillRect/>
+                    </a:stretch>
+                  </pic:blipFill>
+                  <pic:spPr>
+                    <a:xfrm>
+                      <a:off x="0" y="0"/>
+                      <a:ext cx="4971813" cy="3401941"/>
+                    </a:xfrm>
+                    <a:prstGeom prst="rect">
+                      <a:avLst/>
+                    </a:prstGeom>
+                  </pic:spPr>
+                </pic:pic>
+              </a:graphicData>
+            </a:graphic>
+          </wp:inline>
+        </w:drawing>
+      </w:r>
+    </w:p>
+    <w:p>
+      <w:pPr>
+        <w:pStyle w:val="ListParagraph"/>
+        <w:numPr>
+          <w:ilvl w:val="0"/>
+          <w:numId w:val="7"/>
+        </w:numPr>
+      </w:pPr>
+      <w:r>
+        <w:t>Go to “</w:t>
+      </w:r>
+      <w:proofErr w:type="spellStart"/>
+      <w:r>
+        <w:t>wingetpkgs</w:t>
+      </w:r>
+      <w:proofErr w:type="spellEnd"/>
+      <w:r>
+        <w:t xml:space="preserve">-fork” and fork </w:t>
+      </w:r>
+      <w:proofErr w:type="spellStart"/>
+      <w:r>
+        <w:t>ur</w:t>
+      </w:r>
+      <w:proofErr w:type="spellEnd"/>
+      <w:r>
+        <w:t xml:space="preserve"> </w:t>
+      </w:r>
+      <w:proofErr w:type="spellStart"/>
+      <w:r>
+        <w:t>github</w:t>
+      </w:r>
+      <w:proofErr w:type="spellEnd"/>
+      <w:r>
+        <w:t xml:space="preserve"> [username]/</w:t>
+      </w:r>
+      <w:proofErr w:type="spellStart"/>
+      <w:r>
+        <w:t>winget-pkgs</w:t>
+      </w:r>
+      <w:proofErr w:type="spellEnd"/>
+    </w:p>
+    <w:p>
+      <w:pPr>
+        <w:pStyle w:val="ListParagraph"/>
+        <w:numPr>
+          <w:ilvl w:val="0"/>
+          <w:numId w:val="7"/>
+        </w:numPr>
+      </w:pPr>
+      <w:r>
+        <w:t>Click “add-file” &gt; “create new file”</w:t>
+      </w:r>
+    </w:p>
+    <w:p>
+      <w:pPr>
+        <w:pStyle w:val="ListParagraph"/>
+        <w:numPr>
+          <w:ilvl w:val="0"/>
+          <w:numId w:val="7"/>
+        </w:numPr>
+      </w:pPr>
+      <w:r>
+        <w:t xml:space="preserve">Copy the </w:t>
+      </w:r>
+      <w:proofErr w:type="spellStart"/>
+      <w:r>
+        <w:t>Yaml</w:t>
+      </w:r>
+      <w:proofErr w:type="spellEnd"/>
+      <w:r>
+        <w:t xml:space="preserve"> content </w:t>
+      </w:r>
+    </w:p>
+    <w:p>
+      <w:pPr>
+        <w:pStyle w:val="ListParagraph"/>
+        <w:numPr>
+          <w:ilvl w:val="0"/>
+          <w:numId w:val="7"/>
+        </w:numPr>
+      </w:pPr>
+      <w:r>
+        <w:t>Commit changes</w:t>
+      </w:r>
+    </w:p>
+    <w:p>
+      <w:pPr>
+        <w:pStyle w:val="ListParagraph"/>
+      </w:pPr>
+      <w:r>
+        <w:drawing>
+          <wp:inline distT="0" distB="0" distL="0" distR="0" wp14:anchorId="24B8D45D" wp14:editId="61B7AD8E">
+            <wp:extent cx="3802086" cy="4158532"/>
+            <wp:effectExtent l="0" t="0" r="8255" b="0"/>
+            <wp:docPr id="1307804145" name="Picture 1"/>
+            <wp:cNvGraphicFramePr>
+              <a:graphicFrameLocks xmlns:a="http://schemas.openxmlformats.org/drawingml/2006/main" noChangeAspect="1"/>
+            </wp:cNvGraphicFramePr>
+            <a:graphic xmlns:a="http://schemas.openxmlformats.org/drawingml/2006/main">
+              <a:graphicData uri="http://schemas.openxmlformats.org/drawingml/2006/picture">
+                <pic:pic xmlns:pic="http://schemas.openxmlformats.org/drawingml/2006/picture">
+                  <pic:nvPicPr>
+                    <pic:cNvPr id="1307804145" name=""/>
+                    <pic:cNvPicPr/>
+                  </pic:nvPicPr>
+                  <pic:blipFill>
+                    <a:blip r:embed="rId46"/>
+                    <a:stretch>
+                      <a:fillRect/>
+                    </a:stretch>
+                  </pic:blipFill>
+                  <pic:spPr>
+                    <a:xfrm>
+                      <a:off x="0" y="0"/>
+                      <a:ext cx="3804664" cy="4161351"/>
+                    </a:xfrm>
+                    <a:prstGeom prst="rect">
+                      <a:avLst/>
+                    </a:prstGeom>
+                  </pic:spPr>
+                </pic:pic>
+              </a:graphicData>
+            </a:graphic>
+          </wp:inline>
+        </w:drawing>
+      </w:r>
+    </w:p>
+    <w:p>
+      <w:pPr>
+        <w:pStyle w:val="ListParagraph"/>
+        <w:numPr>
+          <w:ilvl w:val="0"/>
+          <w:numId w:val="7"/>
+        </w:numPr>
+      </w:pPr>
+      <w:r>
+        <w:t>Comparing changes</w:t>
+      </w:r>
+    </w:p>
+    <w:p>
+      <w:r>
+        <w:lastRenderedPageBreak/>
+        <w:drawing>
+          <wp:inline distT="0" distB="0" distL="0" distR="0" wp14:anchorId="14100B82" wp14:editId="5B5AC6C9">
+            <wp:extent cx="4508390" cy="3341084"/>
+            <wp:effectExtent l="0" t="0" r="6985" b="0"/>
+            <wp:docPr id="1265070540" name="Picture 1"/>
+            <wp:cNvGraphicFramePr>
+              <a:graphicFrameLocks xmlns:a="http://schemas.openxmlformats.org/drawingml/2006/main" noChangeAspect="1"/>
+            </wp:cNvGraphicFramePr>
+            <a:graphic xmlns:a="http://schemas.openxmlformats.org/drawingml/2006/main">
+              <a:graphicData uri="http://schemas.openxmlformats.org/drawingml/2006/picture">
+                <pic:pic xmlns:pic="http://schemas.openxmlformats.org/drawingml/2006/picture">
+                  <pic:nvPicPr>
+                    <pic:cNvPr id="1265070540" name=""/>
+                    <pic:cNvPicPr/>
+                  </pic:nvPicPr>
+                  <pic:blipFill>
+                    <a:blip r:embed="rId47"/>
+                    <a:stretch>
+                      <a:fillRect/>
+                    </a:stretch>
+                  </pic:blipFill>
+                  <pic:spPr>
+                    <a:xfrm>
+                      <a:off x="0" y="0"/>
+                      <a:ext cx="4510588" cy="3342713"/>
+                    </a:xfrm>
+                    <a:prstGeom prst="rect">
+                      <a:avLst/>
+                    </a:prstGeom>
+                  </pic:spPr>
+                </pic:pic>
+              </a:graphicData>
+            </a:graphic>
+          </wp:inline>
+        </w:drawing>
+      </w:r>
+    </w:p>
+    <w:p>
+      <w:pPr>
+        <w:pStyle w:val="ListParagraph"/>
+        <w:numPr>
+          <w:ilvl w:val="0"/>
+          <w:numId w:val="7"/>
+        </w:numPr>
+      </w:pPr>
+      <w:r>
+        <w:t>Create pull request</w:t>
+      </w:r>
+    </w:p>
+    <w:p>
+      <w:r>
+        <w:drawing>
+          <wp:inline distT="0" distB="0" distL="0" distR="0" wp14:anchorId="4DF87995" wp14:editId="052987BE">
+            <wp:extent cx="5731510" cy="4080510"/>
+            <wp:effectExtent l="0" t="0" r="2540" b="0"/>
+            <wp:docPr id="2135612624" name="Picture 1"/>
+            <wp:cNvGraphicFramePr>
+              <a:graphicFrameLocks xmlns:a="http://schemas.openxmlformats.org/drawingml/2006/main" noChangeAspect="1"/>
+            </wp:cNvGraphicFramePr>
+            <a:graphic xmlns:a="http://schemas.openxmlformats.org/drawingml/2006/main">
+              <a:graphicData uri="http://schemas.openxmlformats.org/drawingml/2006/picture">
+                <pic:pic xmlns:pic="http://schemas.openxmlformats.org/drawingml/2006/picture">
+                  <pic:nvPicPr>
+                    <pic:cNvPr id="2135612624" name=""/>
+                    <pic:cNvPicPr/>
+                  </pic:nvPicPr>
+                  <pic:blipFill>
+                    <a:blip r:embed="rId48"/>
+                    <a:stretch>
+                      <a:fillRect/>
+                    </a:stretch>
+                  </pic:blipFill>
+                  <pic:spPr>
+                    <a:xfrm>
+                      <a:off x="0" y="0"/>
+                      <a:ext cx="5731510" cy="4080510"/>
+                    </a:xfrm>
+                    <a:prstGeom prst="rect">
+                      <a:avLst/>
+                    </a:prstGeom>
+                  </pic:spPr>
+                </pic:pic>
+              </a:graphicData>
+            </a:graphic>
+          </wp:inline>
+        </w:drawing>
+      </w:r>
+    </w:p>
+    <w:p>
+      <w:pPr>
+        <w:pStyle w:val="ListParagraph"/>
+        <w:numPr>
+          <w:ilvl w:val="0"/>
+          <w:numId w:val="7"/>
+        </w:numPr>
+      </w:pPr>
+      <w:r>
+        <w:t>Create Title and write description</w:t>
+      </w:r>
+      <w:r>
+        <w:t>, submit pull request to Microsoft</w:t>
+      </w:r>
+    </w:p>
+    <w:p>
+      <w:r>
+        <w:lastRenderedPageBreak/>
+        <w:drawing>
+          <wp:inline distT="0" distB="0" distL="0" distR="0" wp14:anchorId="0EF2DFB9" wp14:editId="7F08682D">
+            <wp:extent cx="5731510" cy="4007485"/>
+            <wp:effectExtent l="0" t="0" r="2540" b="0"/>
+            <wp:docPr id="2040771798" name="Picture 1"/>
+            <wp:cNvGraphicFramePr>
+              <a:graphicFrameLocks xmlns:a="http://schemas.openxmlformats.org/drawingml/2006/main" noChangeAspect="1"/>
+            </wp:cNvGraphicFramePr>
+            <a:graphic xmlns:a="http://schemas.openxmlformats.org/drawingml/2006/main">
+              <a:graphicData uri="http://schemas.openxmlformats.org/drawingml/2006/picture">
+                <pic:pic xmlns:pic="http://schemas.openxmlformats.org/drawingml/2006/picture">
+                  <pic:nvPicPr>
+                    <pic:cNvPr id="2040771798" name=""/>
+                    <pic:cNvPicPr/>
+                  </pic:nvPicPr>
+                  <pic:blipFill>
+                    <a:blip r:embed="rId49"/>
+                    <a:stretch>
+                      <a:fillRect/>
+                    </a:stretch>
+                  </pic:blipFill>
+                  <pic:spPr>
+                    <a:xfrm>
+                      <a:off x="0" y="0"/>
+                      <a:ext cx="5731510" cy="4007485"/>
+                    </a:xfrm>
+                    <a:prstGeom prst="rect">
+                      <a:avLst/>
+                    </a:prstGeom>
+                  </pic:spPr>
+                </pic:pic>
+              </a:graphicData>
+            </a:graphic>
+          </wp:inline>
+        </w:drawing>
+      </w:r>
+    </w:p>
+    <w:p>
+      <w:pPr>
+        <w:pStyle w:val="ListParagraph"/>
+        <w:numPr>
+          <w:ilvl w:val="0"/>
+          <w:numId w:val="7"/>
+        </w:numPr>
+      </w:pPr>
+      <w:r>
+        <w:t>Created</w:t>
+      </w:r>
+    </w:p>
+    <w:p>
+      <w:r>
+        <w:drawing>
+          <wp:inline distT="0" distB="0" distL="0" distR="0" wp14:anchorId="42261500" wp14:editId="4CFBB046">
+            <wp:extent cx="5731510" cy="4108450"/>
+            <wp:effectExtent l="0" t="0" r="2540" b="6350"/>
+            <wp:docPr id="1511840887" name="Picture 1"/>
+            <wp:cNvGraphicFramePr>
+              <a:graphicFrameLocks xmlns:a="http://schemas.openxmlformats.org/drawingml/2006/main" noChangeAspect="1"/>
+            </wp:cNvGraphicFramePr>
+            <a:graphic xmlns:a="http://schemas.openxmlformats.org/drawingml/2006/main">
+              <a:graphicData uri="http://schemas.openxmlformats.org/drawingml/2006/picture">
+                <pic:pic xmlns:pic="http://schemas.openxmlformats.org/drawingml/2006/picture">
+                  <pic:nvPicPr>
+                    <pic:cNvPr id="1511840887" name=""/>
+                    <pic:cNvPicPr/>
+                  </pic:nvPicPr>
+                  <pic:blipFill>
+                    <a:blip r:embed="rId50"/>
+                    <a:stretch>
+                      <a:fillRect/>
+                    </a:stretch>
+                  </pic:blipFill>
+                  <pic:spPr>
+                    <a:xfrm>
+                      <a:off x="0" y="0"/>
+                      <a:ext cx="5731510" cy="4108450"/>
+                    </a:xfrm>
+                    <a:prstGeom prst="rect">
+                      <a:avLst/>
+                    </a:prstGeom>
+                  </pic:spPr>
+                </pic:pic>
+              </a:graphicData>
+            </a:graphic>
+          </wp:inline>
+        </w:drawing>
+      </w:r>
+    </w:p>
     <w:p/>
     <w:p/>
-    <w:p/>
-    <w:p>
-      <w:r>
-        <w:t>1.3</w:t>
-      </w:r>
-    </w:p>
     <w:sectPr>
       <w:pgSz w:w="11906" w:h="16838"/>
       <w:pgMar w:top="1440" w:right="1440" w:bottom="1440" w:left="1440" w:header="708" w:footer="708" w:gutter="0"/>
@@ -784,6 +3186,703 @@
     </w:sectPr>
   </w:body>
 </w:document>
+</file>
+
+<file path=word/numbering.xml><?xml version="1.0" encoding="utf-8"?>
+<w:numbering xmlns:wpc="http://schemas.microsoft.com/office/word/2010/wordprocessingCanvas" xmlns:cx="http://schemas.microsoft.com/office/drawing/2014/chartex" xmlns:cx1="http://schemas.microsoft.com/office/drawing/2015/9/8/chartex" xmlns:cx2="http://schemas.microsoft.com/office/drawing/2015/10/21/chartex" xmlns:cx3="http://schemas.microsoft.com/office/drawing/2016/5/9/chartex" xmlns:cx4="http://schemas.microsoft.com/office/drawing/2016/5/10/chartex" xmlns:cx5="http://schemas.microsoft.com/office/drawing/2016/5/11/chartex" xmlns:cx6="http://schemas.microsoft.com/office/drawing/2016/5/12/chartex" xmlns:cx7="http://schemas.microsoft.com/office/drawing/2016/5/13/chartex" xmlns:cx8="http://schemas.microsoft.com/office/drawing/2016/5/14/chartex" xmlns:mc="http://schemas.openxmlformats.org/markup-compatibility/2006" xmlns:aink="http://schemas.microsoft.com/office/drawing/2016/ink" xmlns:am3d="http://schemas.microsoft.com/office/drawing/2017/model3d" xmlns:o="urn:schemas-microsoft-com:office:office" xmlns:oel="http://schemas.microsoft.com/office/2019/extlst" xmlns:r="http://schemas.openxmlformats.org/officeDocument/2006/relationships" xmlns:m="http://schemas.openxmlformats.org/officeDocument/2006/math" xmlns:v="urn:schemas-microsoft-com:vml" xmlns:wp14="http://schemas.microsoft.com/office/word/2010/wordprocessingDrawing" xmlns:wp="http://schemas.openxmlformats.org/drawingml/2006/wordprocessingDrawing" xmlns:w10="urn:schemas-microsoft-com:office:word" xmlns:w="http://schemas.openxmlformats.org/wordprocessingml/2006/main" xmlns:w14="http://schemas.microsoft.com/office/word/2010/wordml" xmlns:w15="http://schemas.microsoft.com/office/word/2012/wordml" xmlns:w16cei="http://schemas.microsoft.com/office/word/2026/wordml/cei" xmlns:w16cex="http://schemas.microsoft.com/office/word/2018/wordml/cex" xmlns:w16cid="http://schemas.microsoft.com/office/word/2016/wordml/cid" xmlns:w16="http://schemas.microsoft.com/office/word/2018/wordml" xmlns:w16du="http://schemas.microsoft.com/office/word/2023/wordml/word16du" xmlns:w16sdtdh="http://schemas.microsoft.com/office/word/2020/wordml/sdtdatahash" xmlns:w16sdtfl="http://schemas.microsoft.com/office/word/2024/wordml/sdtformatlock" xmlns:w16se="http://schemas.microsoft.com/office/word/2015/wordml/symex" xmlns:wpg="http://schemas.microsoft.com/office/word/2010/wordprocessingGroup" xmlns:wpi="http://schemas.microsoft.com/office/word/2010/wordprocessingInk" xmlns:wne="http://schemas.microsoft.com/office/word/2006/wordml" xmlns:wps="http://schemas.microsoft.com/office/word/2010/wordprocessingShape" mc:Ignorable="w14 w15 w16se w16cid w16 w16cex w16sdtdh w16sdtfl w16du wp14">
+  <w:abstractNum w:abstractNumId="0" w15:restartNumberingAfterBreak="0">
+    <w:nsid w:val="0C5F4888"/>
+    <w:multiLevelType w:val="hybridMultilevel"/>
+    <w:tmpl w:val="CDE2DD76"/>
+    <w:lvl w:ilvl="0" w:tplc="3809000F">
+      <w:start w:val="1"/>
+      <w:numFmt w:val="decimal"/>
+      <w:lvlText w:val="%1."/>
+      <w:lvlJc w:val="left"/>
+      <w:pPr>
+        <w:ind w:left="720" w:hanging="360"/>
+      </w:pPr>
+      <w:rPr>
+        <w:rFonts w:hint="default"/>
+      </w:rPr>
+    </w:lvl>
+    <w:lvl w:ilvl="1" w:tplc="38090019" w:tentative="1">
+      <w:start w:val="1"/>
+      <w:numFmt w:val="lowerLetter"/>
+      <w:lvlText w:val="%2."/>
+      <w:lvlJc w:val="left"/>
+      <w:pPr>
+        <w:ind w:left="1440" w:hanging="360"/>
+      </w:pPr>
+    </w:lvl>
+    <w:lvl w:ilvl="2" w:tplc="3809001B" w:tentative="1">
+      <w:start w:val="1"/>
+      <w:numFmt w:val="lowerRoman"/>
+      <w:lvlText w:val="%3."/>
+      <w:lvlJc w:val="right"/>
+      <w:pPr>
+        <w:ind w:left="2160" w:hanging="180"/>
+      </w:pPr>
+    </w:lvl>
+    <w:lvl w:ilvl="3" w:tplc="3809000F" w:tentative="1">
+      <w:start w:val="1"/>
+      <w:numFmt w:val="decimal"/>
+      <w:lvlText w:val="%4."/>
+      <w:lvlJc w:val="left"/>
+      <w:pPr>
+        <w:ind w:left="2880" w:hanging="360"/>
+      </w:pPr>
+    </w:lvl>
+    <w:lvl w:ilvl="4" w:tplc="38090019" w:tentative="1">
+      <w:start w:val="1"/>
+      <w:numFmt w:val="lowerLetter"/>
+      <w:lvlText w:val="%5."/>
+      <w:lvlJc w:val="left"/>
+      <w:pPr>
+        <w:ind w:left="3600" w:hanging="360"/>
+      </w:pPr>
+    </w:lvl>
+    <w:lvl w:ilvl="5" w:tplc="3809001B" w:tentative="1">
+      <w:start w:val="1"/>
+      <w:numFmt w:val="lowerRoman"/>
+      <w:lvlText w:val="%6."/>
+      <w:lvlJc w:val="right"/>
+      <w:pPr>
+        <w:ind w:left="4320" w:hanging="180"/>
+      </w:pPr>
+    </w:lvl>
+    <w:lvl w:ilvl="6" w:tplc="3809000F" w:tentative="1">
+      <w:start w:val="1"/>
+      <w:numFmt w:val="decimal"/>
+      <w:lvlText w:val="%7."/>
+      <w:lvlJc w:val="left"/>
+      <w:pPr>
+        <w:ind w:left="5040" w:hanging="360"/>
+      </w:pPr>
+    </w:lvl>
+    <w:lvl w:ilvl="7" w:tplc="38090019" w:tentative="1">
+      <w:start w:val="1"/>
+      <w:numFmt w:val="lowerLetter"/>
+      <w:lvlText w:val="%8."/>
+      <w:lvlJc w:val="left"/>
+      <w:pPr>
+        <w:ind w:left="5760" w:hanging="360"/>
+      </w:pPr>
+    </w:lvl>
+    <w:lvl w:ilvl="8" w:tplc="3809001B" w:tentative="1">
+      <w:start w:val="1"/>
+      <w:numFmt w:val="lowerRoman"/>
+      <w:lvlText w:val="%9."/>
+      <w:lvlJc w:val="right"/>
+      <w:pPr>
+        <w:ind w:left="6480" w:hanging="180"/>
+      </w:pPr>
+    </w:lvl>
+  </w:abstractNum>
+  <w:abstractNum w:abstractNumId="1" w15:restartNumberingAfterBreak="0">
+    <w:nsid w:val="125F093F"/>
+    <w:multiLevelType w:val="hybridMultilevel"/>
+    <w:tmpl w:val="A4501364"/>
+    <w:lvl w:ilvl="0" w:tplc="3809000F">
+      <w:start w:val="1"/>
+      <w:numFmt w:val="decimal"/>
+      <w:lvlText w:val="%1."/>
+      <w:lvlJc w:val="left"/>
+      <w:pPr>
+        <w:ind w:left="720" w:hanging="360"/>
+      </w:pPr>
+      <w:rPr>
+        <w:rFonts w:hint="default"/>
+      </w:rPr>
+    </w:lvl>
+    <w:lvl w:ilvl="1" w:tplc="38090019" w:tentative="1">
+      <w:start w:val="1"/>
+      <w:numFmt w:val="lowerLetter"/>
+      <w:lvlText w:val="%2."/>
+      <w:lvlJc w:val="left"/>
+      <w:pPr>
+        <w:ind w:left="1440" w:hanging="360"/>
+      </w:pPr>
+    </w:lvl>
+    <w:lvl w:ilvl="2" w:tplc="3809001B" w:tentative="1">
+      <w:start w:val="1"/>
+      <w:numFmt w:val="lowerRoman"/>
+      <w:lvlText w:val="%3."/>
+      <w:lvlJc w:val="right"/>
+      <w:pPr>
+        <w:ind w:left="2160" w:hanging="180"/>
+      </w:pPr>
+    </w:lvl>
+    <w:lvl w:ilvl="3" w:tplc="3809000F" w:tentative="1">
+      <w:start w:val="1"/>
+      <w:numFmt w:val="decimal"/>
+      <w:lvlText w:val="%4."/>
+      <w:lvlJc w:val="left"/>
+      <w:pPr>
+        <w:ind w:left="2880" w:hanging="360"/>
+      </w:pPr>
+    </w:lvl>
+    <w:lvl w:ilvl="4" w:tplc="38090019" w:tentative="1">
+      <w:start w:val="1"/>
+      <w:numFmt w:val="lowerLetter"/>
+      <w:lvlText w:val="%5."/>
+      <w:lvlJc w:val="left"/>
+      <w:pPr>
+        <w:ind w:left="3600" w:hanging="360"/>
+      </w:pPr>
+    </w:lvl>
+    <w:lvl w:ilvl="5" w:tplc="3809001B" w:tentative="1">
+      <w:start w:val="1"/>
+      <w:numFmt w:val="lowerRoman"/>
+      <w:lvlText w:val="%6."/>
+      <w:lvlJc w:val="right"/>
+      <w:pPr>
+        <w:ind w:left="4320" w:hanging="180"/>
+      </w:pPr>
+    </w:lvl>
+    <w:lvl w:ilvl="6" w:tplc="3809000F" w:tentative="1">
+      <w:start w:val="1"/>
+      <w:numFmt w:val="decimal"/>
+      <w:lvlText w:val="%7."/>
+      <w:lvlJc w:val="left"/>
+      <w:pPr>
+        <w:ind w:left="5040" w:hanging="360"/>
+      </w:pPr>
+    </w:lvl>
+    <w:lvl w:ilvl="7" w:tplc="38090019" w:tentative="1">
+      <w:start w:val="1"/>
+      <w:numFmt w:val="lowerLetter"/>
+      <w:lvlText w:val="%8."/>
+      <w:lvlJc w:val="left"/>
+      <w:pPr>
+        <w:ind w:left="5760" w:hanging="360"/>
+      </w:pPr>
+    </w:lvl>
+    <w:lvl w:ilvl="8" w:tplc="3809001B" w:tentative="1">
+      <w:start w:val="1"/>
+      <w:numFmt w:val="lowerRoman"/>
+      <w:lvlText w:val="%9."/>
+      <w:lvlJc w:val="right"/>
+      <w:pPr>
+        <w:ind w:left="6480" w:hanging="180"/>
+      </w:pPr>
+    </w:lvl>
+  </w:abstractNum>
+  <w:abstractNum w:abstractNumId="2" w15:restartNumberingAfterBreak="0">
+    <w:nsid w:val="3C7642A9"/>
+    <w:multiLevelType w:val="hybridMultilevel"/>
+    <w:tmpl w:val="A36A91CE"/>
+    <w:lvl w:ilvl="0" w:tplc="CD8C0192">
+      <w:start w:val="1"/>
+      <w:numFmt w:val="bullet"/>
+      <w:lvlText w:val=""/>
+      <w:lvlJc w:val="left"/>
+      <w:pPr>
+        <w:ind w:left="1080" w:hanging="360"/>
+      </w:pPr>
+      <w:rPr>
+        <w:rFonts w:ascii="Wingdings" w:eastAsiaTheme="minorHAnsi" w:hAnsi="Wingdings" w:cstheme="minorBidi" w:hint="default"/>
+      </w:rPr>
+    </w:lvl>
+    <w:lvl w:ilvl="1" w:tplc="38090003" w:tentative="1">
+      <w:start w:val="1"/>
+      <w:numFmt w:val="bullet"/>
+      <w:lvlText w:val="o"/>
+      <w:lvlJc w:val="left"/>
+      <w:pPr>
+        <w:ind w:left="1800" w:hanging="360"/>
+      </w:pPr>
+      <w:rPr>
+        <w:rFonts w:ascii="Courier New" w:hAnsi="Courier New" w:cs="Courier New" w:hint="default"/>
+      </w:rPr>
+    </w:lvl>
+    <w:lvl w:ilvl="2" w:tplc="38090005" w:tentative="1">
+      <w:start w:val="1"/>
+      <w:numFmt w:val="bullet"/>
+      <w:lvlText w:val=""/>
+      <w:lvlJc w:val="left"/>
+      <w:pPr>
+        <w:ind w:left="2520" w:hanging="360"/>
+      </w:pPr>
+      <w:rPr>
+        <w:rFonts w:ascii="Wingdings" w:hAnsi="Wingdings" w:hint="default"/>
+      </w:rPr>
+    </w:lvl>
+    <w:lvl w:ilvl="3" w:tplc="38090001" w:tentative="1">
+      <w:start w:val="1"/>
+      <w:numFmt w:val="bullet"/>
+      <w:lvlText w:val=""/>
+      <w:lvlJc w:val="left"/>
+      <w:pPr>
+        <w:ind w:left="3240" w:hanging="360"/>
+      </w:pPr>
+      <w:rPr>
+        <w:rFonts w:ascii="Symbol" w:hAnsi="Symbol" w:hint="default"/>
+      </w:rPr>
+    </w:lvl>
+    <w:lvl w:ilvl="4" w:tplc="38090003" w:tentative="1">
+      <w:start w:val="1"/>
+      <w:numFmt w:val="bullet"/>
+      <w:lvlText w:val="o"/>
+      <w:lvlJc w:val="left"/>
+      <w:pPr>
+        <w:ind w:left="3960" w:hanging="360"/>
+      </w:pPr>
+      <w:rPr>
+        <w:rFonts w:ascii="Courier New" w:hAnsi="Courier New" w:cs="Courier New" w:hint="default"/>
+      </w:rPr>
+    </w:lvl>
+    <w:lvl w:ilvl="5" w:tplc="38090005" w:tentative="1">
+      <w:start w:val="1"/>
+      <w:numFmt w:val="bullet"/>
+      <w:lvlText w:val=""/>
+      <w:lvlJc w:val="left"/>
+      <w:pPr>
+        <w:ind w:left="4680" w:hanging="360"/>
+      </w:pPr>
+      <w:rPr>
+        <w:rFonts w:ascii="Wingdings" w:hAnsi="Wingdings" w:hint="default"/>
+      </w:rPr>
+    </w:lvl>
+    <w:lvl w:ilvl="6" w:tplc="38090001" w:tentative="1">
+      <w:start w:val="1"/>
+      <w:numFmt w:val="bullet"/>
+      <w:lvlText w:val=""/>
+      <w:lvlJc w:val="left"/>
+      <w:pPr>
+        <w:ind w:left="5400" w:hanging="360"/>
+      </w:pPr>
+      <w:rPr>
+        <w:rFonts w:ascii="Symbol" w:hAnsi="Symbol" w:hint="default"/>
+      </w:rPr>
+    </w:lvl>
+    <w:lvl w:ilvl="7" w:tplc="38090003" w:tentative="1">
+      <w:start w:val="1"/>
+      <w:numFmt w:val="bullet"/>
+      <w:lvlText w:val="o"/>
+      <w:lvlJc w:val="left"/>
+      <w:pPr>
+        <w:ind w:left="6120" w:hanging="360"/>
+      </w:pPr>
+      <w:rPr>
+        <w:rFonts w:ascii="Courier New" w:hAnsi="Courier New" w:cs="Courier New" w:hint="default"/>
+      </w:rPr>
+    </w:lvl>
+    <w:lvl w:ilvl="8" w:tplc="38090005" w:tentative="1">
+      <w:start w:val="1"/>
+      <w:numFmt w:val="bullet"/>
+      <w:lvlText w:val=""/>
+      <w:lvlJc w:val="left"/>
+      <w:pPr>
+        <w:ind w:left="6840" w:hanging="360"/>
+      </w:pPr>
+      <w:rPr>
+        <w:rFonts w:ascii="Wingdings" w:hAnsi="Wingdings" w:hint="default"/>
+      </w:rPr>
+    </w:lvl>
+  </w:abstractNum>
+  <w:abstractNum w:abstractNumId="3" w15:restartNumberingAfterBreak="0">
+    <w:nsid w:val="45C42DAC"/>
+    <w:multiLevelType w:val="multilevel"/>
+    <w:tmpl w:val="A10E22C6"/>
+    <w:lvl w:ilvl="0">
+      <w:start w:val="1"/>
+      <w:numFmt w:val="decimal"/>
+      <w:lvlText w:val="%1"/>
+      <w:lvlJc w:val="left"/>
+      <w:pPr>
+        <w:ind w:left="600" w:hanging="600"/>
+      </w:pPr>
+      <w:rPr>
+        <w:rFonts w:hint="default"/>
+      </w:rPr>
+    </w:lvl>
+    <w:lvl w:ilvl="1">
+      <w:start w:val="1"/>
+      <w:numFmt w:val="decimal"/>
+      <w:lvlText w:val="%1.%2"/>
+      <w:lvlJc w:val="left"/>
+      <w:pPr>
+        <w:ind w:left="600" w:hanging="600"/>
+      </w:pPr>
+      <w:rPr>
+        <w:rFonts w:hint="default"/>
+      </w:rPr>
+    </w:lvl>
+    <w:lvl w:ilvl="2">
+      <w:start w:val="1"/>
+      <w:numFmt w:val="decimal"/>
+      <w:lvlText w:val="%1.%2.%3"/>
+      <w:lvlJc w:val="left"/>
+      <w:pPr>
+        <w:ind w:left="720" w:hanging="720"/>
+      </w:pPr>
+      <w:rPr>
+        <w:rFonts w:hint="default"/>
+      </w:rPr>
+    </w:lvl>
+    <w:lvl w:ilvl="3">
+      <w:start w:val="1"/>
+      <w:numFmt w:val="decimal"/>
+      <w:lvlText w:val="%1.%2.%3.%4"/>
+      <w:lvlJc w:val="left"/>
+      <w:pPr>
+        <w:ind w:left="1080" w:hanging="1080"/>
+      </w:pPr>
+      <w:rPr>
+        <w:rFonts w:hint="default"/>
+      </w:rPr>
+    </w:lvl>
+    <w:lvl w:ilvl="4">
+      <w:start w:val="1"/>
+      <w:numFmt w:val="decimal"/>
+      <w:lvlText w:val="%1.%2.%3.%4.%5"/>
+      <w:lvlJc w:val="left"/>
+      <w:pPr>
+        <w:ind w:left="1080" w:hanging="1080"/>
+      </w:pPr>
+      <w:rPr>
+        <w:rFonts w:hint="default"/>
+      </w:rPr>
+    </w:lvl>
+    <w:lvl w:ilvl="5">
+      <w:start w:val="1"/>
+      <w:numFmt w:val="decimal"/>
+      <w:lvlText w:val="%1.%2.%3.%4.%5.%6"/>
+      <w:lvlJc w:val="left"/>
+      <w:pPr>
+        <w:ind w:left="1440" w:hanging="1440"/>
+      </w:pPr>
+      <w:rPr>
+        <w:rFonts w:hint="default"/>
+      </w:rPr>
+    </w:lvl>
+    <w:lvl w:ilvl="6">
+      <w:start w:val="1"/>
+      <w:numFmt w:val="decimal"/>
+      <w:lvlText w:val="%1.%2.%3.%4.%5.%6.%7"/>
+      <w:lvlJc w:val="left"/>
+      <w:pPr>
+        <w:ind w:left="1440" w:hanging="1440"/>
+      </w:pPr>
+      <w:rPr>
+        <w:rFonts w:hint="default"/>
+      </w:rPr>
+    </w:lvl>
+    <w:lvl w:ilvl="7">
+      <w:start w:val="1"/>
+      <w:numFmt w:val="decimal"/>
+      <w:lvlText w:val="%1.%2.%3.%4.%5.%6.%7.%8"/>
+      <w:lvlJc w:val="left"/>
+      <w:pPr>
+        <w:ind w:left="1800" w:hanging="1800"/>
+      </w:pPr>
+      <w:rPr>
+        <w:rFonts w:hint="default"/>
+      </w:rPr>
+    </w:lvl>
+    <w:lvl w:ilvl="8">
+      <w:start w:val="1"/>
+      <w:numFmt w:val="decimal"/>
+      <w:lvlText w:val="%1.%2.%3.%4.%5.%6.%7.%8.%9"/>
+      <w:lvlJc w:val="left"/>
+      <w:pPr>
+        <w:ind w:left="1800" w:hanging="1800"/>
+      </w:pPr>
+      <w:rPr>
+        <w:rFonts w:hint="default"/>
+      </w:rPr>
+    </w:lvl>
+  </w:abstractNum>
+  <w:abstractNum w:abstractNumId="4" w15:restartNumberingAfterBreak="0">
+    <w:nsid w:val="4A5B5414"/>
+    <w:multiLevelType w:val="hybridMultilevel"/>
+    <w:tmpl w:val="2564B972"/>
+    <w:lvl w:ilvl="0" w:tplc="3809000F">
+      <w:start w:val="1"/>
+      <w:numFmt w:val="decimal"/>
+      <w:lvlText w:val="%1."/>
+      <w:lvlJc w:val="left"/>
+      <w:pPr>
+        <w:ind w:left="720" w:hanging="360"/>
+      </w:pPr>
+      <w:rPr>
+        <w:rFonts w:hint="default"/>
+      </w:rPr>
+    </w:lvl>
+    <w:lvl w:ilvl="1" w:tplc="38090019" w:tentative="1">
+      <w:start w:val="1"/>
+      <w:numFmt w:val="lowerLetter"/>
+      <w:lvlText w:val="%2."/>
+      <w:lvlJc w:val="left"/>
+      <w:pPr>
+        <w:ind w:left="1440" w:hanging="360"/>
+      </w:pPr>
+    </w:lvl>
+    <w:lvl w:ilvl="2" w:tplc="3809001B" w:tentative="1">
+      <w:start w:val="1"/>
+      <w:numFmt w:val="lowerRoman"/>
+      <w:lvlText w:val="%3."/>
+      <w:lvlJc w:val="right"/>
+      <w:pPr>
+        <w:ind w:left="2160" w:hanging="180"/>
+      </w:pPr>
+    </w:lvl>
+    <w:lvl w:ilvl="3" w:tplc="3809000F" w:tentative="1">
+      <w:start w:val="1"/>
+      <w:numFmt w:val="decimal"/>
+      <w:lvlText w:val="%4."/>
+      <w:lvlJc w:val="left"/>
+      <w:pPr>
+        <w:ind w:left="2880" w:hanging="360"/>
+      </w:pPr>
+    </w:lvl>
+    <w:lvl w:ilvl="4" w:tplc="38090019" w:tentative="1">
+      <w:start w:val="1"/>
+      <w:numFmt w:val="lowerLetter"/>
+      <w:lvlText w:val="%5."/>
+      <w:lvlJc w:val="left"/>
+      <w:pPr>
+        <w:ind w:left="3600" w:hanging="360"/>
+      </w:pPr>
+    </w:lvl>
+    <w:lvl w:ilvl="5" w:tplc="3809001B" w:tentative="1">
+      <w:start w:val="1"/>
+      <w:numFmt w:val="lowerRoman"/>
+      <w:lvlText w:val="%6."/>
+      <w:lvlJc w:val="right"/>
+      <w:pPr>
+        <w:ind w:left="4320" w:hanging="180"/>
+      </w:pPr>
+    </w:lvl>
+    <w:lvl w:ilvl="6" w:tplc="3809000F" w:tentative="1">
+      <w:start w:val="1"/>
+      <w:numFmt w:val="decimal"/>
+      <w:lvlText w:val="%7."/>
+      <w:lvlJc w:val="left"/>
+      <w:pPr>
+        <w:ind w:left="5040" w:hanging="360"/>
+      </w:pPr>
+    </w:lvl>
+    <w:lvl w:ilvl="7" w:tplc="38090019" w:tentative="1">
+      <w:start w:val="1"/>
+      <w:numFmt w:val="lowerLetter"/>
+      <w:lvlText w:val="%8."/>
+      <w:lvlJc w:val="left"/>
+      <w:pPr>
+        <w:ind w:left="5760" w:hanging="360"/>
+      </w:pPr>
+    </w:lvl>
+    <w:lvl w:ilvl="8" w:tplc="3809001B" w:tentative="1">
+      <w:start w:val="1"/>
+      <w:numFmt w:val="lowerRoman"/>
+      <w:lvlText w:val="%9."/>
+      <w:lvlJc w:val="right"/>
+      <w:pPr>
+        <w:ind w:left="6480" w:hanging="180"/>
+      </w:pPr>
+    </w:lvl>
+  </w:abstractNum>
+  <w:abstractNum w:abstractNumId="5" w15:restartNumberingAfterBreak="0">
+    <w:nsid w:val="61EA16FD"/>
+    <w:multiLevelType w:val="hybridMultilevel"/>
+    <w:tmpl w:val="09CE68D4"/>
+    <w:lvl w:ilvl="0" w:tplc="3809000F">
+      <w:start w:val="1"/>
+      <w:numFmt w:val="decimal"/>
+      <w:lvlText w:val="%1."/>
+      <w:lvlJc w:val="left"/>
+      <w:pPr>
+        <w:ind w:left="720" w:hanging="360"/>
+      </w:pPr>
+      <w:rPr>
+        <w:rFonts w:hint="default"/>
+      </w:rPr>
+    </w:lvl>
+    <w:lvl w:ilvl="1" w:tplc="38090019" w:tentative="1">
+      <w:start w:val="1"/>
+      <w:numFmt w:val="lowerLetter"/>
+      <w:lvlText w:val="%2."/>
+      <w:lvlJc w:val="left"/>
+      <w:pPr>
+        <w:ind w:left="1440" w:hanging="360"/>
+      </w:pPr>
+    </w:lvl>
+    <w:lvl w:ilvl="2" w:tplc="3809001B" w:tentative="1">
+      <w:start w:val="1"/>
+      <w:numFmt w:val="lowerRoman"/>
+      <w:lvlText w:val="%3."/>
+      <w:lvlJc w:val="right"/>
+      <w:pPr>
+        <w:ind w:left="2160" w:hanging="180"/>
+      </w:pPr>
+    </w:lvl>
+    <w:lvl w:ilvl="3" w:tplc="3809000F" w:tentative="1">
+      <w:start w:val="1"/>
+      <w:numFmt w:val="decimal"/>
+      <w:lvlText w:val="%4."/>
+      <w:lvlJc w:val="left"/>
+      <w:pPr>
+        <w:ind w:left="2880" w:hanging="360"/>
+      </w:pPr>
+    </w:lvl>
+    <w:lvl w:ilvl="4" w:tplc="38090019" w:tentative="1">
+      <w:start w:val="1"/>
+      <w:numFmt w:val="lowerLetter"/>
+      <w:lvlText w:val="%5."/>
+      <w:lvlJc w:val="left"/>
+      <w:pPr>
+        <w:ind w:left="3600" w:hanging="360"/>
+      </w:pPr>
+    </w:lvl>
+    <w:lvl w:ilvl="5" w:tplc="3809001B" w:tentative="1">
+      <w:start w:val="1"/>
+      <w:numFmt w:val="lowerRoman"/>
+      <w:lvlText w:val="%6."/>
+      <w:lvlJc w:val="right"/>
+      <w:pPr>
+        <w:ind w:left="4320" w:hanging="180"/>
+      </w:pPr>
+    </w:lvl>
+    <w:lvl w:ilvl="6" w:tplc="3809000F" w:tentative="1">
+      <w:start w:val="1"/>
+      <w:numFmt w:val="decimal"/>
+      <w:lvlText w:val="%7."/>
+      <w:lvlJc w:val="left"/>
+      <w:pPr>
+        <w:ind w:left="5040" w:hanging="360"/>
+      </w:pPr>
+    </w:lvl>
+    <w:lvl w:ilvl="7" w:tplc="38090019" w:tentative="1">
+      <w:start w:val="1"/>
+      <w:numFmt w:val="lowerLetter"/>
+      <w:lvlText w:val="%8."/>
+      <w:lvlJc w:val="left"/>
+      <w:pPr>
+        <w:ind w:left="5760" w:hanging="360"/>
+      </w:pPr>
+    </w:lvl>
+    <w:lvl w:ilvl="8" w:tplc="3809001B" w:tentative="1">
+      <w:start w:val="1"/>
+      <w:numFmt w:val="lowerRoman"/>
+      <w:lvlText w:val="%9."/>
+      <w:lvlJc w:val="right"/>
+      <w:pPr>
+        <w:ind w:left="6480" w:hanging="180"/>
+      </w:pPr>
+    </w:lvl>
+  </w:abstractNum>
+  <w:abstractNum w:abstractNumId="6" w15:restartNumberingAfterBreak="0">
+    <w:nsid w:val="66E0731C"/>
+    <w:multiLevelType w:val="hybridMultilevel"/>
+    <w:tmpl w:val="9EEE93F6"/>
+    <w:lvl w:ilvl="0" w:tplc="3809000F">
+      <w:start w:val="1"/>
+      <w:numFmt w:val="decimal"/>
+      <w:lvlText w:val="%1."/>
+      <w:lvlJc w:val="left"/>
+      <w:pPr>
+        <w:ind w:left="720" w:hanging="360"/>
+      </w:pPr>
+      <w:rPr>
+        <w:rFonts w:hint="default"/>
+      </w:rPr>
+    </w:lvl>
+    <w:lvl w:ilvl="1" w:tplc="38090019" w:tentative="1">
+      <w:start w:val="1"/>
+      <w:numFmt w:val="lowerLetter"/>
+      <w:lvlText w:val="%2."/>
+      <w:lvlJc w:val="left"/>
+      <w:pPr>
+        <w:ind w:left="1440" w:hanging="360"/>
+      </w:pPr>
+    </w:lvl>
+    <w:lvl w:ilvl="2" w:tplc="3809001B" w:tentative="1">
+      <w:start w:val="1"/>
+      <w:numFmt w:val="lowerRoman"/>
+      <w:lvlText w:val="%3."/>
+      <w:lvlJc w:val="right"/>
+      <w:pPr>
+        <w:ind w:left="2160" w:hanging="180"/>
+      </w:pPr>
+    </w:lvl>
+    <w:lvl w:ilvl="3" w:tplc="3809000F" w:tentative="1">
+      <w:start w:val="1"/>
+      <w:numFmt w:val="decimal"/>
+      <w:lvlText w:val="%4."/>
+      <w:lvlJc w:val="left"/>
+      <w:pPr>
+        <w:ind w:left="2880" w:hanging="360"/>
+      </w:pPr>
+    </w:lvl>
+    <w:lvl w:ilvl="4" w:tplc="38090019" w:tentative="1">
+      <w:start w:val="1"/>
+      <w:numFmt w:val="lowerLetter"/>
+      <w:lvlText w:val="%5."/>
+      <w:lvlJc w:val="left"/>
+      <w:pPr>
+        <w:ind w:left="3600" w:hanging="360"/>
+      </w:pPr>
+    </w:lvl>
+    <w:lvl w:ilvl="5" w:tplc="3809001B" w:tentative="1">
+      <w:start w:val="1"/>
+      <w:numFmt w:val="lowerRoman"/>
+      <w:lvlText w:val="%6."/>
+      <w:lvlJc w:val="right"/>
+      <w:pPr>
+        <w:ind w:left="4320" w:hanging="180"/>
+      </w:pPr>
+    </w:lvl>
+    <w:lvl w:ilvl="6" w:tplc="3809000F" w:tentative="1">
+      <w:start w:val="1"/>
+      <w:numFmt w:val="decimal"/>
+      <w:lvlText w:val="%7."/>
+      <w:lvlJc w:val="left"/>
+      <w:pPr>
+        <w:ind w:left="5040" w:hanging="360"/>
+      </w:pPr>
+    </w:lvl>
+    <w:lvl w:ilvl="7" w:tplc="38090019" w:tentative="1">
+      <w:start w:val="1"/>
+      <w:numFmt w:val="lowerLetter"/>
+      <w:lvlText w:val="%8."/>
+      <w:lvlJc w:val="left"/>
+      <w:pPr>
+        <w:ind w:left="5760" w:hanging="360"/>
+      </w:pPr>
+    </w:lvl>
+    <w:lvl w:ilvl="8" w:tplc="3809001B" w:tentative="1">
+      <w:start w:val="1"/>
+      <w:numFmt w:val="lowerRoman"/>
+      <w:lvlText w:val="%9."/>
+      <w:lvlJc w:val="right"/>
+      <w:pPr>
+        <w:ind w:left="6480" w:hanging="180"/>
+      </w:pPr>
+    </w:lvl>
+  </w:abstractNum>
+  <w:num w:numId="1" w16cid:durableId="524832419">
+    <w:abstractNumId w:val="4"/>
+  </w:num>
+  <w:num w:numId="2" w16cid:durableId="2111198169">
+    <w:abstractNumId w:val="2"/>
+  </w:num>
+  <w:num w:numId="3" w16cid:durableId="623509742">
+    <w:abstractNumId w:val="3"/>
+  </w:num>
+  <w:num w:numId="4" w16cid:durableId="1373572773">
+    <w:abstractNumId w:val="5"/>
+  </w:num>
+  <w:num w:numId="5" w16cid:durableId="619536365">
+    <w:abstractNumId w:val="1"/>
+  </w:num>
+  <w:num w:numId="6" w16cid:durableId="18896152">
+    <w:abstractNumId w:val="6"/>
+  </w:num>
+  <w:num w:numId="7" w16cid:durableId="510491024">
+    <w:abstractNumId w:val="0"/>
+  </w:num>
+</w:numbering>
 </file>
 
 <file path=word/styles.xml><?xml version="1.0" encoding="utf-8"?>
@@ -1389,7 +4488,6 @@
   <w:style w:type="character" w:default="1" w:styleId="DefaultParagraphFont">
     <w:name w:val="Default Paragraph Font"/>
     <w:uiPriority w:val="1"/>
-    <w:semiHidden/>
     <w:unhideWhenUsed/>
   </w:style>
   <w:style w:type="table" w:default="1" w:styleId="TableNormal">
@@ -1701,6 +4799,73 @@
       <w:smallCaps/>
       <w:color w:val="0F4761" w:themeColor="accent1" w:themeShade="BF"/>
       <w:spacing w:val="5"/>
+    </w:rPr>
+  </w:style>
+  <w:style w:type="paragraph" w:styleId="TOCHeading">
+    <w:name w:val="TOC Heading"/>
+    <w:basedOn w:val="Heading1"/>
+    <w:next w:val="Normal"/>
+    <w:uiPriority w:val="39"/>
+    <w:unhideWhenUsed/>
+    <w:qFormat/>
+    <w:rsid w:val="00EF43C6"/>
+    <w:pPr>
+      <w:spacing w:before="240" w:after="0" w:line="259" w:lineRule="auto"/>
+      <w:outlineLvl w:val="9"/>
+    </w:pPr>
+    <w:rPr>
+      <w:kern w:val="0"/>
+      <w:sz w:val="32"/>
+      <w:szCs w:val="32"/>
+      <w:lang w:val="en-US"/>
+      <w14:ligatures w14:val="none"/>
+    </w:rPr>
+  </w:style>
+  <w:style w:type="paragraph" w:styleId="TOC1">
+    <w:name w:val="toc 1"/>
+    <w:basedOn w:val="Normal"/>
+    <w:next w:val="Normal"/>
+    <w:autoRedefine/>
+    <w:uiPriority w:val="39"/>
+    <w:unhideWhenUsed/>
+    <w:rsid w:val="00EF43C6"/>
+    <w:pPr>
+      <w:spacing w:after="100"/>
+    </w:pPr>
+  </w:style>
+  <w:style w:type="character" w:styleId="Hyperlink">
+    <w:name w:val="Hyperlink"/>
+    <w:basedOn w:val="DefaultParagraphFont"/>
+    <w:uiPriority w:val="99"/>
+    <w:unhideWhenUsed/>
+    <w:rsid w:val="00EF43C6"/>
+    <w:rPr>
+      <w:color w:val="467886" w:themeColor="hyperlink"/>
+      <w:u w:val="single"/>
+    </w:rPr>
+  </w:style>
+  <w:style w:type="character" w:styleId="UnresolvedMention">
+    <w:name w:val="Unresolved Mention"/>
+    <w:basedOn w:val="DefaultParagraphFont"/>
+    <w:uiPriority w:val="99"/>
+    <w:semiHidden/>
+    <w:unhideWhenUsed/>
+    <w:rsid w:val="000330FA"/>
+    <w:rPr>
+      <w:color w:val="605E5C"/>
+      <w:shd w:val="clear" w:color="auto" w:fill="E1DFDD"/>
+    </w:rPr>
+  </w:style>
+  <w:style w:type="character" w:styleId="FollowedHyperlink">
+    <w:name w:val="FollowedHyperlink"/>
+    <w:basedOn w:val="DefaultParagraphFont"/>
+    <w:uiPriority w:val="99"/>
+    <w:semiHidden/>
+    <w:unhideWhenUsed/>
+    <w:rsid w:val="007B1D1D"/>
+    <w:rPr>
+      <w:color w:val="96607D" w:themeColor="followedHyperlink"/>
+      <w:u w:val="single"/>
     </w:rPr>
   </w:style>
 </w:styles>
@@ -2019,4 +5184,16 @@
     </a:ext>
   </a:extLst>
 </a:theme>
+</file>
+
+<file path=customXml/item1.xml><?xml version="1.0" encoding="utf-8"?>
+<b:Sources xmlns:b="http://schemas.openxmlformats.org/officeDocument/2006/bibliography" xmlns="http://schemas.openxmlformats.org/officeDocument/2006/bibliography" SelectedStyle="\APASixthEditionOfficeOnline.xsl" StyleName="APA" Version="6"/>
+</file>
+
+<file path=customXml/itemProps1.xml><?xml version="1.0" encoding="utf-8"?>
+<ds:datastoreItem xmlns:ds="http://schemas.openxmlformats.org/officeDocument/2006/customXml" ds:itemID="{E8DB67A3-EA56-4AC3-B40B-19257FE1F8D9}">
+  <ds:schemaRefs>
+    <ds:schemaRef ds:uri="http://schemas.openxmlformats.org/officeDocument/2006/bibliography"/>
+  </ds:schemaRefs>
+</ds:datastoreItem>
 </file>
</xml_diff>